<commit_message>
MAJ PRJ 1730 - 31.01.25
</commit_message>
<xml_diff>
--- a/doc/Affichage/Affiche_Page.docx
+++ b/doc/Affichage/Affiche_Page.docx
@@ -1,6 +1,6 @@
 
 <file path=word/document.xml><?xml version="1.0" encoding="utf-8"?>
-<w:document xmlns:wpc="http://schemas.microsoft.com/office/word/2010/wordprocessingCanvas" xmlns:mc="http://schemas.openxmlformats.org/markup-compatibility/2006" xmlns:o="urn:schemas-microsoft-com:office:office" xmlns:r="http://schemas.openxmlformats.org/officeDocument/2006/relationships" xmlns:m="http://schemas.openxmlformats.org/officeDocument/2006/math" xmlns:v="urn:schemas-microsoft-com:vml" xmlns:wp14="http://schemas.microsoft.com/office/word/2010/wordprocessingDrawing" xmlns:wp="http://schemas.openxmlformats.org/drawingml/2006/wordprocessingDrawing" xmlns:w10="urn:schemas-microsoft-com:office:word" xmlns:w="http://schemas.openxmlformats.org/wordprocessingml/2006/main" xmlns:w14="http://schemas.microsoft.com/office/word/2010/wordml" xmlns:wpg="http://schemas.microsoft.com/office/word/2010/wordprocessingGroup" xmlns:wpi="http://schemas.microsoft.com/office/word/2010/wordprocessingInk" xmlns:wne="http://schemas.microsoft.com/office/word/2006/wordml" xmlns:wps="http://schemas.microsoft.com/office/word/2010/wordprocessingShape" mc:Ignorable="w14 wp14">
+<w:document xmlns:wpc="http://schemas.microsoft.com/office/word/2010/wordprocessingCanvas" xmlns:cx="http://schemas.microsoft.com/office/drawing/2014/chartex" xmlns:cx1="http://schemas.microsoft.com/office/drawing/2015/9/8/chartex" xmlns:cx2="http://schemas.microsoft.com/office/drawing/2015/10/21/chartex" xmlns:cx3="http://schemas.microsoft.com/office/drawing/2016/5/9/chartex" xmlns:cx4="http://schemas.microsoft.com/office/drawing/2016/5/10/chartex" xmlns:cx5="http://schemas.microsoft.com/office/drawing/2016/5/11/chartex" xmlns:cx6="http://schemas.microsoft.com/office/drawing/2016/5/12/chartex" xmlns:cx7="http://schemas.microsoft.com/office/drawing/2016/5/13/chartex" xmlns:cx8="http://schemas.microsoft.com/office/drawing/2016/5/14/chartex" xmlns:mc="http://schemas.openxmlformats.org/markup-compatibility/2006" xmlns:aink="http://schemas.microsoft.com/office/drawing/2016/ink" xmlns:am3d="http://schemas.microsoft.com/office/drawing/2017/model3d" xmlns:o="urn:schemas-microsoft-com:office:office" xmlns:oel="http://schemas.microsoft.com/office/2019/extlst" xmlns:r="http://schemas.openxmlformats.org/officeDocument/2006/relationships" xmlns:m="http://schemas.openxmlformats.org/officeDocument/2006/math" xmlns:v="urn:schemas-microsoft-com:vml" xmlns:wp14="http://schemas.microsoft.com/office/word/2010/wordprocessingDrawing" xmlns:wp="http://schemas.openxmlformats.org/drawingml/2006/wordprocessingDrawing" xmlns:w10="urn:schemas-microsoft-com:office:word" xmlns:w="http://schemas.openxmlformats.org/wordprocessingml/2006/main" xmlns:w14="http://schemas.microsoft.com/office/word/2010/wordml" xmlns:w15="http://schemas.microsoft.com/office/word/2012/wordml" xmlns:w16cex="http://schemas.microsoft.com/office/word/2018/wordml/cex" xmlns:w16cid="http://schemas.microsoft.com/office/word/2016/wordml/cid" xmlns:w16="http://schemas.microsoft.com/office/word/2018/wordml" xmlns:w16du="http://schemas.microsoft.com/office/word/2023/wordml/word16du" xmlns:w16sdtdh="http://schemas.microsoft.com/office/word/2020/wordml/sdtdatahash" xmlns:w16se="http://schemas.microsoft.com/office/word/2015/wordml/symex" xmlns:wpg="http://schemas.microsoft.com/office/word/2010/wordprocessingGroup" xmlns:wpi="http://schemas.microsoft.com/office/word/2010/wordprocessingInk" xmlns:wne="http://schemas.microsoft.com/office/word/2006/wordml" xmlns:wps="http://schemas.microsoft.com/office/word/2010/wordprocessingShape" mc:Ignorable="w14 w15 w16se w16cid w16 w16cex w16sdtdh w16du wp14">
   <w:body>
     <w:p>
       <w:r>
@@ -12,7 +12,7 @@
         <mc:AlternateContent>
           <mc:Choice Requires="wps">
             <w:drawing>
-              <wp:anchor distT="0" distB="0" distL="114300" distR="114300" simplePos="0" relativeHeight="251661824" behindDoc="0" locked="0" layoutInCell="0" allowOverlap="1" wp14:anchorId="56520C08" wp14:editId="24A46A52">
+              <wp:anchor distT="0" distB="0" distL="114300" distR="114300" simplePos="0" relativeHeight="251661824" behindDoc="0" locked="0" layoutInCell="0" allowOverlap="1" wp14:anchorId="77848DFA" wp14:editId="3347B438">
                 <wp:simplePos x="0" y="0"/>
                 <wp:positionH relativeFrom="column">
                   <wp:posOffset>-125730</wp:posOffset>
@@ -78,16 +78,8 @@
                               <w:rPr>
                                 <w:sz w:val="28"/>
                               </w:rPr>
-                              <w:t xml:space="preserve"> </w:t>
+                              <w:t xml:space="preserve"> wireless</w:t>
                             </w:r>
-                            <w:proofErr w:type="spellStart"/>
-                            <w:r>
-                              <w:rPr>
-                                <w:sz w:val="28"/>
-                              </w:rPr>
-                              <w:t>wireless</w:t>
-                            </w:r>
-                            <w:proofErr w:type="spellEnd"/>
                             <w:r>
                               <w:rPr>
                                 <w:sz w:val="28"/>
@@ -394,11 +386,11 @@
           </mc:Choice>
           <mc:Fallback>
             <w:pict>
-              <v:shapetype id="_x0000_t202" coordsize="21600,21600" o:spt="202" path="m,l,21600r21600,l21600,xe">
+              <v:shapetype w14:anchorId="77848DFA" id="_x0000_t202" coordsize="21600,21600" o:spt="202" path="m,l,21600r21600,l21600,xe">
                 <v:stroke joinstyle="miter"/>
                 <v:path gradientshapeok="t" o:connecttype="rect"/>
               </v:shapetype>
-              <v:shape id="Text Box 4" o:spid="_x0000_s1026" type="#_x0000_t202" style="position:absolute;margin-left:-9.9pt;margin-top:-18.55pt;width:713.35pt;height:136.15pt;z-index:251661824;visibility:visible;mso-wrap-style:square;mso-width-percent:0;mso-height-percent:0;mso-wrap-distance-left:9pt;mso-wrap-distance-top:0;mso-wrap-distance-right:9pt;mso-wrap-distance-bottom:0;mso-position-horizontal:absolute;mso-position-horizontal-relative:text;mso-position-vertical:absolute;mso-position-vertical-relative:text;mso-width-percent:0;mso-height-percent:0;mso-width-relative:page;mso-height-relative:page;v-text-anchor:top" o:gfxdata="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" o:allowincell="f" strokecolor="#a5a5a5" strokeweight="1pt">
+              <v:shape id="Text Box 4" o:spid="_x0000_s1026" type="#_x0000_t202" style="position:absolute;margin-left:-9.9pt;margin-top:-18.55pt;width:713.35pt;height:136.15pt;z-index:251661824;visibility:visible;mso-wrap-style:square;mso-width-percent:0;mso-height-percent:0;mso-wrap-distance-left:9pt;mso-wrap-distance-top:0;mso-wrap-distance-right:9pt;mso-wrap-distance-bottom:0;mso-position-horizontal:absolute;mso-position-horizontal-relative:text;mso-position-vertical:absolute;mso-position-vertical-relative:text;mso-width-percent:0;mso-height-percent:0;mso-width-relative:page;mso-height-relative:page;v-text-anchor:top" o:gfxdata="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" o:allowincell="f" strokecolor="#a5a5a5" strokeweight="1pt">
                 <v:textbox>
                   <w:txbxContent>
                     <w:p>
@@ -424,16 +416,8 @@
                         <w:rPr>
                           <w:sz w:val="28"/>
                         </w:rPr>
-                        <w:t xml:space="preserve"> </w:t>
+                        <w:t xml:space="preserve"> wireless</w:t>
                       </w:r>
-                      <w:proofErr w:type="spellStart"/>
-                      <w:r>
-                        <w:rPr>
-                          <w:sz w:val="28"/>
-                        </w:rPr>
-                        <w:t>wireless</w:t>
-                      </w:r>
-                      <w:proofErr w:type="spellEnd"/>
                       <w:r>
                         <w:rPr>
                           <w:sz w:val="28"/>
@@ -737,7 +721,7 @@
         <mc:AlternateContent>
           <mc:Choice Requires="wps">
             <w:drawing>
-              <wp:anchor distT="0" distB="0" distL="114300" distR="114300" simplePos="0" relativeHeight="251662848" behindDoc="0" locked="0" layoutInCell="1" allowOverlap="1" wp14:anchorId="330B3B32" wp14:editId="50EAAF40">
+              <wp:anchor distT="0" distB="0" distL="114300" distR="114300" simplePos="0" relativeHeight="251662848" behindDoc="0" locked="0" layoutInCell="1" allowOverlap="1" wp14:anchorId="60D9A0AF" wp14:editId="17F63956">
                 <wp:simplePos x="0" y="0"/>
                 <wp:positionH relativeFrom="column">
                   <wp:posOffset>5420857</wp:posOffset>
@@ -817,17 +801,8 @@
                                 <w:b/>
                                 <w:sz w:val="44"/>
                               </w:rPr>
-                              <w:t xml:space="preserve">Portier </w:t>
+                              <w:t>Portier wireless</w:t>
                             </w:r>
-                            <w:proofErr w:type="spellStart"/>
-                            <w:r>
-                              <w:rPr>
-                                <w:b/>
-                                <w:sz w:val="44"/>
-                              </w:rPr>
-                              <w:t>wireless</w:t>
-                            </w:r>
-                            <w:proofErr w:type="spellEnd"/>
                           </w:p>
                         </w:txbxContent>
                       </wps:txbx>
@@ -851,7 +826,7 @@
           </mc:Choice>
           <mc:Fallback>
             <w:pict>
-              <v:shape id="Zone de texte 15" o:spid="_x0000_s1027" type="#_x0000_t202" style="position:absolute;margin-left:426.85pt;margin-top:-106.2pt;width:276.75pt;height:73.55pt;z-index:251662848;visibility:visible;mso-wrap-style:square;mso-width-percent:0;mso-height-percent:0;mso-wrap-distance-left:9pt;mso-wrap-distance-top:0;mso-wrap-distance-right:9pt;mso-wrap-distance-bottom:0;mso-position-horizontal:absolute;mso-position-horizontal-relative:text;mso-position-vertical:absolute;mso-position-vertical-relative:text;mso-width-percent:0;mso-height-percent:0;mso-width-relative:margin;mso-height-relative:margin;v-text-anchor:middle" o:gfxdata="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" fillcolor="white [3201]" strokecolor="black [3213]">
+              <v:shape w14:anchorId="60D9A0AF" id="Zone de texte 15" o:spid="_x0000_s1027" type="#_x0000_t202" style="position:absolute;margin-left:426.85pt;margin-top:-106.2pt;width:276.75pt;height:73.55pt;z-index:251662848;visibility:visible;mso-wrap-style:square;mso-width-percent:0;mso-height-percent:0;mso-wrap-distance-left:9pt;mso-wrap-distance-top:0;mso-wrap-distance-right:9pt;mso-wrap-distance-bottom:0;mso-position-horizontal:absolute;mso-position-horizontal-relative:text;mso-position-vertical:absolute;mso-position-vertical-relative:text;mso-width-percent:0;mso-height-percent:0;mso-width-relative:margin;mso-height-relative:margin;v-text-anchor:middle" o:gfxdata="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" fillcolor="white [3201]" strokecolor="black [3213]">
                 <v:textbox>
                   <w:txbxContent>
                     <w:p>
@@ -883,17 +858,8 @@
                           <w:b/>
                           <w:sz w:val="44"/>
                         </w:rPr>
-                        <w:t xml:space="preserve">Portier </w:t>
+                        <w:t>Portier wireless</w:t>
                       </w:r>
-                      <w:proofErr w:type="spellStart"/>
-                      <w:r>
-                        <w:rPr>
-                          <w:b/>
-                          <w:sz w:val="44"/>
-                        </w:rPr>
-                        <w:t>wireless</w:t>
-                      </w:r>
-                      <w:proofErr w:type="spellEnd"/>
                     </w:p>
                   </w:txbxContent>
                 </v:textbox>
@@ -913,7 +879,7 @@
           <w:lang w:eastAsia="fr-CH"/>
         </w:rPr>
         <w:drawing>
-          <wp:anchor distT="0" distB="0" distL="114300" distR="114300" simplePos="0" relativeHeight="251663872" behindDoc="0" locked="0" layoutInCell="1" allowOverlap="1" wp14:anchorId="2F6A8FE4" wp14:editId="261EE145">
+          <wp:anchor distT="0" distB="0" distL="114300" distR="114300" simplePos="0" relativeHeight="251663872" behindDoc="0" locked="0" layoutInCell="1" allowOverlap="1" wp14:anchorId="5C0250F6" wp14:editId="5FE8DA76">
             <wp:simplePos x="0" y="0"/>
             <wp:positionH relativeFrom="column">
               <wp:posOffset>212753</wp:posOffset>
@@ -938,11 +904,11 @@
                     </pic:cNvPicPr>
                   </pic:nvPicPr>
                   <pic:blipFill rotWithShape="1">
-                    <a:blip r:embed="rId9" cstate="print">
+                    <a:blip r:embed="rId8" cstate="print">
                       <a:extLst>
                         <a:ext uri="{BEBA8EAE-BF5A-486C-A8C5-ECC9F3942E4B}">
                           <a14:imgProps xmlns:a14="http://schemas.microsoft.com/office/drawing/2010/main">
-                            <a14:imgLayer r:embed="rId10">
+                            <a14:imgLayer r:embed="rId9">
                               <a14:imgEffect>
                                 <a14:backgroundRemoval t="9940" b="94980" l="4311" r="98682">
                                   <a14:foregroundMark x1="9770" y1="22356" x2="9770" y2="82363"/>
@@ -1011,7 +977,7 @@
           <w:lang w:eastAsia="fr-CH"/>
         </w:rPr>
         <w:drawing>
-          <wp:anchor distT="0" distB="0" distL="114300" distR="114300" simplePos="0" relativeHeight="251664896" behindDoc="0" locked="0" layoutInCell="1" allowOverlap="1" wp14:anchorId="55178A62" wp14:editId="0324A214">
+          <wp:anchor distT="0" distB="0" distL="114300" distR="114300" simplePos="0" relativeHeight="251664896" behindDoc="0" locked="0" layoutInCell="1" allowOverlap="1" wp14:anchorId="0311CCB1" wp14:editId="5CE66463">
             <wp:simplePos x="0" y="0"/>
             <wp:positionH relativeFrom="column">
               <wp:posOffset>5335905</wp:posOffset>
@@ -1036,11 +1002,11 @@
                     </pic:cNvPicPr>
                   </pic:nvPicPr>
                   <pic:blipFill rotWithShape="1">
-                    <a:blip r:embed="rId9" cstate="print">
+                    <a:blip r:embed="rId8" cstate="print">
                       <a:extLst>
                         <a:ext uri="{BEBA8EAE-BF5A-486C-A8C5-ECC9F3942E4B}">
                           <a14:imgProps xmlns:a14="http://schemas.microsoft.com/office/drawing/2010/main">
-                            <a14:imgLayer r:embed="rId10">
+                            <a14:imgLayer r:embed="rId9">
                               <a14:imgEffect>
                                 <a14:backgroundRemoval t="9940" b="94980" l="4311" r="98682">
                                   <a14:foregroundMark x1="9770" y1="22356" x2="9770" y2="82363"/>
@@ -1114,10 +1080,7 @@
     <w:p/>
     <w:p/>
     <w:p/>
-    <w:p>
-      <w:bookmarkStart w:id="0" w:name="_GoBack"/>
-      <w:bookmarkEnd w:id="0"/>
-    </w:p>
+    <w:p/>
     <w:p/>
     <w:p/>
     <w:p/>
@@ -1132,7 +1095,7 @@
         <mc:AlternateContent>
           <mc:Choice Requires="wps">
             <w:drawing>
-              <wp:anchor distT="0" distB="0" distL="114300" distR="114300" simplePos="0" relativeHeight="251677184" behindDoc="0" locked="0" layoutInCell="1" allowOverlap="1" wp14:anchorId="1EAB031C" wp14:editId="21A2FED3">
+              <wp:anchor distT="0" distB="0" distL="114300" distR="114300" simplePos="0" relativeHeight="251677184" behindDoc="0" locked="0" layoutInCell="1" allowOverlap="1" wp14:anchorId="0DA60BC1" wp14:editId="361D90CE">
                 <wp:simplePos x="0" y="0"/>
                 <wp:positionH relativeFrom="column">
                   <wp:posOffset>6358890</wp:posOffset>
@@ -1197,7 +1160,7 @@
           </mc:Choice>
           <mc:Fallback>
             <w:pict>
-              <v:shape id="Arc 20" o:spid="_x0000_s1026" style="position:absolute;margin-left:500.7pt;margin-top:11.35pt;width:32.35pt;height:30.85pt;rotation:-11085362fd;z-index:251677184;visibility:visible;mso-wrap-style:square;mso-width-percent:0;mso-height-percent:0;mso-wrap-distance-left:9pt;mso-wrap-distance-top:0;mso-wrap-distance-right:9pt;mso-wrap-distance-bottom:0;mso-position-horizontal:absolute;mso-position-horizontal-relative:text;mso-position-vertical:absolute;mso-position-vertical-relative:text;mso-width-percent:0;mso-height-percent:0;mso-width-relative:margin;mso-height-relative:margin;v-text-anchor:middle" coordsize="410845,391795" o:gfxdata="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" path="m205422,nsc318874,,410845,87707,410845,195898r-205422,c205423,130599,205422,65299,205422,xem205422,nfc318874,,410845,87707,410845,195898e" filled="f" strokecolor="black [3213]">
+              <v:shape w14:anchorId="24F25BC3" id="Arc 20" o:spid="_x0000_s1026" style="position:absolute;margin-left:500.7pt;margin-top:11.35pt;width:32.35pt;height:30.85pt;rotation:-11085362fd;z-index:251677184;visibility:visible;mso-wrap-style:square;mso-width-percent:0;mso-height-percent:0;mso-wrap-distance-left:9pt;mso-wrap-distance-top:0;mso-wrap-distance-right:9pt;mso-wrap-distance-bottom:0;mso-position-horizontal:absolute;mso-position-horizontal-relative:text;mso-position-vertical:absolute;mso-position-vertical-relative:text;mso-width-percent:0;mso-height-percent:0;mso-width-relative:margin;mso-height-relative:margin;v-text-anchor:middle" coordsize="410845,391795" o:gfxdata="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" path="m205422,nsc318874,,410845,87707,410845,195898r-205422,c205423,130599,205422,65299,205422,xem205422,nfc318874,,410845,87707,410845,195898e" filled="f" strokecolor="black [3213]">
                 <v:path arrowok="t" o:connecttype="custom" o:connectlocs="205422,0;410845,195898" o:connectangles="0,0"/>
               </v:shape>
             </w:pict>
@@ -1214,7 +1177,7 @@
         <mc:AlternateContent>
           <mc:Choice Requires="wps">
             <w:drawing>
-              <wp:anchor distT="0" distB="0" distL="114300" distR="114300" simplePos="0" relativeHeight="251682304" behindDoc="0" locked="0" layoutInCell="1" allowOverlap="1">
+              <wp:anchor distT="0" distB="0" distL="114300" distR="114300" simplePos="0" relativeHeight="251682304" behindDoc="0" locked="0" layoutInCell="1" allowOverlap="1" wp14:anchorId="2748F053" wp14:editId="3438708D">
                 <wp:simplePos x="0" y="0"/>
                 <wp:positionH relativeFrom="column">
                   <wp:posOffset>1643987</wp:posOffset>
@@ -1349,7 +1312,7 @@
           </mc:Choice>
           <mc:Fallback>
             <w:pict>
-              <v:shape id="Forme libre 23" o:spid="_x0000_s1026" style="position:absolute;margin-left:129.45pt;margin-top:10.2pt;width:397.3pt;height:229.4pt;z-index:251682304;visibility:visible;mso-wrap-style:square;mso-width-percent:0;mso-wrap-distance-left:9pt;mso-wrap-distance-top:0;mso-wrap-distance-right:9pt;mso-wrap-distance-bottom:0;mso-position-horizontal:absolute;mso-position-horizontal-relative:text;mso-position-vertical:absolute;mso-position-vertical-relative:text;mso-width-percent:0;mso-width-relative:margin;v-text-anchor:middle" coordsize="5675244,2913374" o:gfxdata="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" path="m,129209c100220,721415,200440,1313622,487018,1749287v286578,435665,720587,821635,1232452,993913c2231335,2915478,2966831,3001618,3558209,2782957,4149587,2564296,4914901,1895061,5267740,1431235,5620579,967409,5599044,273326,5675244,e" filled="f" strokecolor="black [3213]" strokeweight="3.25pt">
+              <v:shape w14:anchorId="00537284" id="Forme libre 23" o:spid="_x0000_s1026" style="position:absolute;margin-left:129.45pt;margin-top:10.2pt;width:397.3pt;height:229.4pt;z-index:251682304;visibility:visible;mso-wrap-style:square;mso-width-percent:0;mso-wrap-distance-left:9pt;mso-wrap-distance-top:0;mso-wrap-distance-right:9pt;mso-wrap-distance-bottom:0;mso-position-horizontal:absolute;mso-position-horizontal-relative:text;mso-position-vertical:absolute;mso-position-vertical-relative:text;mso-width-percent:0;mso-width-relative:margin;v-text-anchor:middle" coordsize="5675244,2913374" o:gfxdata="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" path="m,129209c100220,721415,200440,1313622,487018,1749287v286578,435665,720587,821635,1232452,993913c2231335,2915478,2966831,3001618,3558209,2782957,4149587,2564296,4914901,1895061,5267740,1431235,5620579,967409,5599044,273326,5675244,e" filled="f" strokecolor="black [3213]" strokeweight="3.25pt">
                 <v:stroke startarrow="classic" startarrowwidth="wide" startarrowlength="long" endarrow="classic" endarrowwidth="wide" endarrowlength="long"/>
                 <v:path arrowok="t" o:connecttype="custom" o:connectlocs="0,129209;432976,1749287;1528670,2743200;3163375,2782957;4683209,1431235;5045495,0" o:connectangles="0,0,0,0,0,0"/>
               </v:shape>
@@ -1365,7 +1328,7 @@
         <mc:AlternateContent>
           <mc:Choice Requires="wps">
             <w:drawing>
-              <wp:anchor distT="0" distB="0" distL="114300" distR="114300" simplePos="0" relativeHeight="251676160" behindDoc="0" locked="0" layoutInCell="1" allowOverlap="1" wp14:anchorId="02699647" wp14:editId="27B6E18F">
+              <wp:anchor distT="0" distB="0" distL="114300" distR="114300" simplePos="0" relativeHeight="251676160" behindDoc="0" locked="0" layoutInCell="1" allowOverlap="1" wp14:anchorId="7442A73D" wp14:editId="3C16BD15">
                 <wp:simplePos x="0" y="0"/>
                 <wp:positionH relativeFrom="column">
                   <wp:posOffset>5909310</wp:posOffset>
@@ -1430,7 +1393,7 @@
           </mc:Choice>
           <mc:Fallback>
             <w:pict>
-              <v:shape id="Arc 19" o:spid="_x0000_s1026" style="position:absolute;margin-left:465.3pt;margin-top:8.05pt;width:57.45pt;height:48.95pt;rotation:-11085362fd;z-index:251676160;visibility:visible;mso-wrap-style:square;mso-width-percent:0;mso-height-percent:0;mso-wrap-distance-left:9pt;mso-wrap-distance-top:0;mso-wrap-distance-right:9pt;mso-wrap-distance-bottom:0;mso-position-horizontal:absolute;mso-position-horizontal-relative:text;mso-position-vertical:absolute;mso-position-vertical-relative:text;mso-width-percent:0;mso-height-percent:0;mso-width-relative:margin;mso-height-relative:margin;v-text-anchor:middle" coordsize="729615,621665" o:gfxdata="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" path="m364807,nsc566285,,729615,139165,729615,310833r-364807,c364808,207222,364807,103611,364807,xem364807,nfc566285,,729615,139165,729615,310833e" filled="f" strokecolor="black [3213]">
+              <v:shape w14:anchorId="308DB3EA" id="Arc 19" o:spid="_x0000_s1026" style="position:absolute;margin-left:465.3pt;margin-top:8.05pt;width:57.45pt;height:48.95pt;rotation:-11085362fd;z-index:251676160;visibility:visible;mso-wrap-style:square;mso-width-percent:0;mso-height-percent:0;mso-wrap-distance-left:9pt;mso-wrap-distance-top:0;mso-wrap-distance-right:9pt;mso-wrap-distance-bottom:0;mso-position-horizontal:absolute;mso-position-horizontal-relative:text;mso-position-vertical:absolute;mso-position-vertical-relative:text;mso-width-percent:0;mso-height-percent:0;mso-width-relative:margin;mso-height-relative:margin;v-text-anchor:middle" coordsize="729615,621665" o:gfxdata="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" path="m364807,nsc566285,,729615,139165,729615,310833r-364807,c364808,207222,364807,103611,364807,xem364807,nfc566285,,729615,139165,729615,310833e" filled="f" strokecolor="black [3213]">
                 <v:path arrowok="t" o:connecttype="custom" o:connectlocs="364807,0;729615,310833" o:connectangles="0,0"/>
               </v:shape>
             </w:pict>
@@ -1445,7 +1408,7 @@
         <mc:AlternateContent>
           <mc:Choice Requires="wps">
             <w:drawing>
-              <wp:anchor distT="0" distB="0" distL="114300" distR="114300" simplePos="0" relativeHeight="251672064" behindDoc="0" locked="0" layoutInCell="1" allowOverlap="1" wp14:anchorId="1857CCBB" wp14:editId="7B55DC13">
+              <wp:anchor distT="0" distB="0" distL="114300" distR="114300" simplePos="0" relativeHeight="251672064" behindDoc="0" locked="0" layoutInCell="1" allowOverlap="1" wp14:anchorId="4F609416" wp14:editId="471DF871">
                 <wp:simplePos x="0" y="0"/>
                 <wp:positionH relativeFrom="column">
                   <wp:posOffset>1857375</wp:posOffset>
@@ -1510,7 +1473,7 @@
           </mc:Choice>
           <mc:Fallback>
             <w:pict>
-              <v:shape id="Arc 16" o:spid="_x0000_s1026" style="position:absolute;margin-left:146.25pt;margin-top:6.55pt;width:32.35pt;height:30.85pt;rotation:5279595fd;z-index:251672064;visibility:visible;mso-wrap-style:square;mso-width-percent:0;mso-height-percent:0;mso-wrap-distance-left:9pt;mso-wrap-distance-top:0;mso-wrap-distance-right:9pt;mso-wrap-distance-bottom:0;mso-position-horizontal:absolute;mso-position-horizontal-relative:text;mso-position-vertical:absolute;mso-position-vertical-relative:text;mso-width-percent:0;mso-height-percent:0;mso-width-relative:margin;mso-height-relative:margin;v-text-anchor:middle" coordsize="410845,391795" o:gfxdata="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" path="m205422,nsc318874,,410845,87707,410845,195898r-205422,c205423,130599,205422,65299,205422,xem205422,nfc318874,,410845,87707,410845,195898e" filled="f" strokecolor="black [3213]">
+              <v:shape w14:anchorId="7277273E" id="Arc 16" o:spid="_x0000_s1026" style="position:absolute;margin-left:146.25pt;margin-top:6.55pt;width:32.35pt;height:30.85pt;rotation:5279595fd;z-index:251672064;visibility:visible;mso-wrap-style:square;mso-width-percent:0;mso-height-percent:0;mso-wrap-distance-left:9pt;mso-wrap-distance-top:0;mso-wrap-distance-right:9pt;mso-wrap-distance-bottom:0;mso-position-horizontal:absolute;mso-position-horizontal-relative:text;mso-position-vertical:absolute;mso-position-vertical-relative:text;mso-width-percent:0;mso-height-percent:0;mso-width-relative:margin;mso-height-relative:margin;v-text-anchor:middle" coordsize="410845,391795" o:gfxdata="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" path="m205422,nsc318874,,410845,87707,410845,195898r-205422,c205423,130599,205422,65299,205422,xem205422,nfc318874,,410845,87707,410845,195898e" filled="f" strokecolor="black [3213]">
                 <v:path arrowok="t" o:connecttype="custom" o:connectlocs="205422,0;410845,195898" o:connectangles="0,0"/>
               </v:shape>
             </w:pict>
@@ -1527,7 +1490,7 @@
         <mc:AlternateContent>
           <mc:Choice Requires="wps">
             <w:drawing>
-              <wp:anchor distT="0" distB="0" distL="114300" distR="114300" simplePos="0" relativeHeight="251675136" behindDoc="0" locked="0" layoutInCell="1" allowOverlap="1" wp14:anchorId="53F71A6D" wp14:editId="49BDB957">
+              <wp:anchor distT="0" distB="0" distL="114300" distR="114300" simplePos="0" relativeHeight="251675136" behindDoc="0" locked="0" layoutInCell="1" allowOverlap="1" wp14:anchorId="63D0E8D5" wp14:editId="60810ECA">
                 <wp:simplePos x="0" y="0"/>
                 <wp:positionH relativeFrom="column">
                   <wp:posOffset>5461635</wp:posOffset>
@@ -1592,7 +1555,7 @@
           </mc:Choice>
           <mc:Fallback>
             <w:pict>
-              <v:shape id="Arc 18" o:spid="_x0000_s1026" style="position:absolute;margin-left:430.05pt;margin-top:6.4pt;width:80.3pt;height:76.4pt;rotation:-11085362fd;z-index:251675136;visibility:visible;mso-wrap-style:square;mso-width-percent:0;mso-height-percent:0;mso-wrap-distance-left:9pt;mso-wrap-distance-top:0;mso-wrap-distance-right:9pt;mso-wrap-distance-bottom:0;mso-position-horizontal:absolute;mso-position-horizontal-relative:text;mso-position-vertical:absolute;mso-position-vertical-relative:text;mso-width-percent:0;mso-height-percent:0;mso-width-relative:margin;mso-height-relative:margin;v-text-anchor:middle" coordsize="1019810,970280" o:gfxdata="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" path="m509905,nsc791518,,1019810,217205,1019810,485140r-509905,l509905,xem509905,nfc791518,,1019810,217205,1019810,485140e" filled="f" strokecolor="black [3213]">
+              <v:shape w14:anchorId="15939DEB" id="Arc 18" o:spid="_x0000_s1026" style="position:absolute;margin-left:430.05pt;margin-top:6.4pt;width:80.3pt;height:76.4pt;rotation:-11085362fd;z-index:251675136;visibility:visible;mso-wrap-style:square;mso-width-percent:0;mso-height-percent:0;mso-wrap-distance-left:9pt;mso-wrap-distance-top:0;mso-wrap-distance-right:9pt;mso-wrap-distance-bottom:0;mso-position-horizontal:absolute;mso-position-horizontal-relative:text;mso-position-vertical:absolute;mso-position-vertical-relative:text;mso-width-percent:0;mso-height-percent:0;mso-width-relative:margin;mso-height-relative:margin;v-text-anchor:middle" coordsize="1019810,970280" o:gfxdata="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" path="m509905,nsc791518,,1019810,217205,1019810,485140r-509905,l509905,xem509905,nfc791518,,1019810,217205,1019810,485140e" filled="f" strokecolor="black [3213]">
                 <v:path arrowok="t" o:connecttype="custom" o:connectlocs="509905,0;1019810,485140" o:connectangles="0,0"/>
               </v:shape>
             </w:pict>
@@ -1607,7 +1570,7 @@
         <mc:AlternateContent>
           <mc:Choice Requires="wps">
             <w:drawing>
-              <wp:anchor distT="0" distB="0" distL="114300" distR="114300" simplePos="0" relativeHeight="251667968" behindDoc="0" locked="0" layoutInCell="1" allowOverlap="1" wp14:anchorId="0E7C0E1C" wp14:editId="4835F0EF">
+              <wp:anchor distT="0" distB="0" distL="114300" distR="114300" simplePos="0" relativeHeight="251667968" behindDoc="0" locked="0" layoutInCell="1" allowOverlap="1" wp14:anchorId="52214C4D" wp14:editId="6278F58B">
                 <wp:simplePos x="0" y="0"/>
                 <wp:positionH relativeFrom="column">
                   <wp:posOffset>2083435</wp:posOffset>
@@ -1672,7 +1635,7 @@
           </mc:Choice>
           <mc:Fallback>
             <w:pict>
-              <v:shape id="Arc 11" o:spid="_x0000_s1026" style="position:absolute;margin-left:164.05pt;margin-top:6pt;width:80.3pt;height:76.4pt;rotation:5279595fd;z-index:251667968;visibility:visible;mso-wrap-style:square;mso-width-percent:0;mso-height-percent:0;mso-wrap-distance-left:9pt;mso-wrap-distance-top:0;mso-wrap-distance-right:9pt;mso-wrap-distance-bottom:0;mso-position-horizontal:absolute;mso-position-horizontal-relative:text;mso-position-vertical:absolute;mso-position-vertical-relative:text;mso-width-percent:0;mso-height-percent:0;mso-width-relative:margin;mso-height-relative:margin;v-text-anchor:middle" coordsize="1019810,970280" o:gfxdata="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" path="m509905,nsc791518,,1019810,217205,1019810,485140r-509905,l509905,xem509905,nfc791518,,1019810,217205,1019810,485140e" filled="f" strokecolor="black [3213]">
+              <v:shape w14:anchorId="77B38BB3" id="Arc 11" o:spid="_x0000_s1026" style="position:absolute;margin-left:164.05pt;margin-top:6pt;width:80.3pt;height:76.4pt;rotation:5279595fd;z-index:251667968;visibility:visible;mso-wrap-style:square;mso-width-percent:0;mso-height-percent:0;mso-wrap-distance-left:9pt;mso-wrap-distance-top:0;mso-wrap-distance-right:9pt;mso-wrap-distance-bottom:0;mso-position-horizontal:absolute;mso-position-horizontal-relative:text;mso-position-vertical:absolute;mso-position-vertical-relative:text;mso-width-percent:0;mso-height-percent:0;mso-width-relative:margin;mso-height-relative:margin;v-text-anchor:middle" coordsize="1019810,970280" o:gfxdata="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" path="m509905,nsc791518,,1019810,217205,1019810,485140r-509905,l509905,xem509905,nfc791518,,1019810,217205,1019810,485140e" filled="f" strokecolor="black [3213]">
                 <v:path arrowok="t" o:connecttype="custom" o:connectlocs="509905,0;1019810,485140" o:connectangles="0,0"/>
               </v:shape>
             </w:pict>
@@ -1687,7 +1650,7 @@
         <mc:AlternateContent>
           <mc:Choice Requires="wps">
             <w:drawing>
-              <wp:anchor distT="0" distB="0" distL="114300" distR="114300" simplePos="0" relativeHeight="251670016" behindDoc="0" locked="0" layoutInCell="1" allowOverlap="1" wp14:anchorId="5868D378" wp14:editId="488589D8">
+              <wp:anchor distT="0" distB="0" distL="114300" distR="114300" simplePos="0" relativeHeight="251670016" behindDoc="0" locked="0" layoutInCell="1" allowOverlap="1" wp14:anchorId="5570D1F3" wp14:editId="64334C2A">
                 <wp:simplePos x="0" y="0"/>
                 <wp:positionH relativeFrom="column">
                   <wp:posOffset>1953260</wp:posOffset>
@@ -1752,7 +1715,7 @@
           </mc:Choice>
           <mc:Fallback>
             <w:pict>
-              <v:shape id="Arc 12" o:spid="_x0000_s1026" style="position:absolute;margin-left:153.8pt;margin-top:.55pt;width:57.45pt;height:48.95pt;rotation:5279595fd;z-index:251670016;visibility:visible;mso-wrap-style:square;mso-width-percent:0;mso-height-percent:0;mso-wrap-distance-left:9pt;mso-wrap-distance-top:0;mso-wrap-distance-right:9pt;mso-wrap-distance-bottom:0;mso-position-horizontal:absolute;mso-position-horizontal-relative:text;mso-position-vertical:absolute;mso-position-vertical-relative:text;mso-width-percent:0;mso-height-percent:0;mso-width-relative:margin;mso-height-relative:margin;v-text-anchor:middle" coordsize="729615,621665" o:gfxdata="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" path="m364807,nsc566285,,729615,139165,729615,310833r-364807,c364808,207222,364807,103611,364807,xem364807,nfc566285,,729615,139165,729615,310833e" filled="f" strokecolor="black [3213]">
+              <v:shape w14:anchorId="6488F8BA" id="Arc 12" o:spid="_x0000_s1026" style="position:absolute;margin-left:153.8pt;margin-top:.55pt;width:57.45pt;height:48.95pt;rotation:5279595fd;z-index:251670016;visibility:visible;mso-wrap-style:square;mso-width-percent:0;mso-height-percent:0;mso-wrap-distance-left:9pt;mso-wrap-distance-top:0;mso-wrap-distance-right:9pt;mso-wrap-distance-bottom:0;mso-position-horizontal:absolute;mso-position-horizontal-relative:text;mso-position-vertical:absolute;mso-position-vertical-relative:text;mso-width-percent:0;mso-height-percent:0;mso-width-relative:margin;mso-height-relative:margin;v-text-anchor:middle" coordsize="729615,621665" o:gfxdata="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" path="m364807,nsc566285,,729615,139165,729615,310833r-364807,c364808,207222,364807,103611,364807,xem364807,nfc566285,,729615,139165,729615,310833e" filled="f" strokecolor="black [3213]">
                 <v:path arrowok="t" o:connecttype="custom" o:connectlocs="364807,0;729615,310833" o:connectangles="0,0"/>
               </v:shape>
             </w:pict>
@@ -1769,7 +1732,7 @@
         <mc:AlternateContent>
           <mc:Choice Requires="wps">
             <w:drawing>
-              <wp:anchor distT="0" distB="0" distL="114300" distR="114300" simplePos="0" relativeHeight="251681280" behindDoc="0" locked="0" layoutInCell="1" allowOverlap="1" wp14:anchorId="460608D9" wp14:editId="708E3D74">
+              <wp:anchor distT="0" distB="0" distL="114300" distR="114300" simplePos="0" relativeHeight="251681280" behindDoc="0" locked="0" layoutInCell="1" allowOverlap="1" wp14:anchorId="1EFDCEE3" wp14:editId="09F695F6">
                 <wp:simplePos x="0" y="0"/>
                 <wp:positionH relativeFrom="column">
                   <wp:posOffset>4171315</wp:posOffset>
@@ -1834,7 +1797,7 @@
           </mc:Choice>
           <mc:Fallback>
             <w:pict>
-              <v:shape id="Arc 22" o:spid="_x0000_s1026" style="position:absolute;margin-left:328.45pt;margin-top:2.8pt;width:182.35pt;height:147.25pt;rotation:-11085362fd;z-index:251681280;visibility:visible;mso-wrap-style:square;mso-width-percent:0;mso-height-percent:0;mso-wrap-distance-left:9pt;mso-wrap-distance-top:0;mso-wrap-distance-right:9pt;mso-wrap-distance-bottom:0;mso-position-horizontal:absolute;mso-position-horizontal-relative:text;mso-position-vertical:absolute;mso-position-vertical-relative:text;mso-width-percent:0;mso-height-percent:0;mso-width-relative:margin;mso-height-relative:margin;v-text-anchor:middle" coordsize="2315845,1870075" o:gfxdata="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" path="m1157922,nsc1797425,,2315845,418631,2315845,935038r-1157922,c1157923,623359,1157922,311679,1157922,xem1157922,nfc1797425,,2315845,418631,2315845,935038e" filled="f" strokecolor="black [3213]">
+              <v:shape w14:anchorId="33881E5A" id="Arc 22" o:spid="_x0000_s1026" style="position:absolute;margin-left:328.45pt;margin-top:2.8pt;width:182.35pt;height:147.25pt;rotation:-11085362fd;z-index:251681280;visibility:visible;mso-wrap-style:square;mso-width-percent:0;mso-height-percent:0;mso-wrap-distance-left:9pt;mso-wrap-distance-top:0;mso-wrap-distance-right:9pt;mso-wrap-distance-bottom:0;mso-position-horizontal:absolute;mso-position-horizontal-relative:text;mso-position-vertical:absolute;mso-position-vertical-relative:text;mso-width-percent:0;mso-height-percent:0;mso-width-relative:margin;mso-height-relative:margin;v-text-anchor:middle" coordsize="2315845,1870075" o:gfxdata="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" path="m1157922,nsc1797425,,2315845,418631,2315845,935038r-1157922,c1157923,623359,1157922,311679,1157922,xem1157922,nfc1797425,,2315845,418631,2315845,935038e" filled="f" strokecolor="black [3213]">
                 <v:path arrowok="t" o:connecttype="custom" o:connectlocs="1157922,0;2315845,935038" o:connectangles="0,0"/>
               </v:shape>
             </w:pict>
@@ -1849,7 +1812,7 @@
         <mc:AlternateContent>
           <mc:Choice Requires="wps">
             <w:drawing>
-              <wp:anchor distT="0" distB="0" distL="114300" distR="114300" simplePos="0" relativeHeight="251679232" behindDoc="0" locked="0" layoutInCell="1" allowOverlap="1" wp14:anchorId="1BD87611" wp14:editId="5A362571">
+              <wp:anchor distT="0" distB="0" distL="114300" distR="114300" simplePos="0" relativeHeight="251679232" behindDoc="0" locked="0" layoutInCell="1" allowOverlap="1" wp14:anchorId="53E3BA62" wp14:editId="62722E65">
                 <wp:simplePos x="0" y="0"/>
                 <wp:positionH relativeFrom="column">
                   <wp:posOffset>2524125</wp:posOffset>
@@ -1914,7 +1877,7 @@
           </mc:Choice>
           <mc:Fallback>
             <w:pict>
-              <v:shape id="Arc 21" o:spid="_x0000_s1026" style="position:absolute;margin-left:198.75pt;margin-top:11.3pt;width:128.9pt;height:129.35pt;rotation:5279595fd;z-index:251679232;visibility:visible;mso-wrap-style:square;mso-width-percent:0;mso-height-percent:0;mso-wrap-distance-left:9pt;mso-wrap-distance-top:0;mso-wrap-distance-right:9pt;mso-wrap-distance-bottom:0;mso-position-horizontal:absolute;mso-position-horizontal-relative:text;mso-position-vertical:absolute;mso-position-vertical-relative:text;mso-width-percent:0;mso-height-percent:0;mso-width-relative:margin;mso-height-relative:margin;v-text-anchor:middle" coordsize="1637030,1642745" o:gfxdata="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" path="m818515,nsc1270568,,1637030,367741,1637030,821373r-818515,l818515,xem818515,nfc1270568,,1637030,367741,1637030,821373e" filled="f" strokecolor="black [3213]">
+              <v:shape w14:anchorId="035A0645" id="Arc 21" o:spid="_x0000_s1026" style="position:absolute;margin-left:198.75pt;margin-top:11.3pt;width:128.9pt;height:129.35pt;rotation:5279595fd;z-index:251679232;visibility:visible;mso-wrap-style:square;mso-width-percent:0;mso-height-percent:0;mso-wrap-distance-left:9pt;mso-wrap-distance-top:0;mso-wrap-distance-right:9pt;mso-wrap-distance-bottom:0;mso-position-horizontal:absolute;mso-position-horizontal-relative:text;mso-position-vertical:absolute;mso-position-vertical-relative:text;mso-width-percent:0;mso-height-percent:0;mso-width-relative:margin;mso-height-relative:margin;v-text-anchor:middle" coordsize="1637030,1642745" o:gfxdata="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" path="m818515,nsc1270568,,1637030,367741,1637030,821373r-818515,l818515,xem818515,nfc1270568,,1637030,367741,1637030,821373e" filled="f" strokecolor="black [3213]">
                 <v:path arrowok="t" o:connecttype="custom" o:connectlocs="818515,0;1637030,821373" o:connectangles="0,0"/>
               </v:shape>
             </w:pict>
@@ -1929,7 +1892,7 @@
         <mc:AlternateContent>
           <mc:Choice Requires="wps">
             <w:drawing>
-              <wp:anchor distT="0" distB="0" distL="114300" distR="114300" simplePos="0" relativeHeight="251674112" behindDoc="0" locked="0" layoutInCell="1" allowOverlap="1" wp14:anchorId="6A4753E3" wp14:editId="4D6A24A0">
+              <wp:anchor distT="0" distB="0" distL="114300" distR="114300" simplePos="0" relativeHeight="251674112" behindDoc="0" locked="0" layoutInCell="1" allowOverlap="1" wp14:anchorId="516ACF01" wp14:editId="09942BF0">
                 <wp:simplePos x="0" y="0"/>
                 <wp:positionH relativeFrom="column">
                   <wp:posOffset>4824040</wp:posOffset>
@@ -1988,7 +1951,7 @@
           </mc:Choice>
           <mc:Fallback>
             <w:pict>
-              <v:shape id="Arc 17" o:spid="_x0000_s1026" style="position:absolute;margin-left:379.85pt;margin-top:9.9pt;width:99.35pt;height:97.8pt;rotation:-11085362fd;z-index:251674112;visibility:visible;mso-wrap-style:square;mso-wrap-distance-left:9pt;mso-wrap-distance-top:0;mso-wrap-distance-right:9pt;mso-wrap-distance-bottom:0;mso-position-horizontal:absolute;mso-position-horizontal-relative:text;mso-position-vertical:absolute;mso-position-vertical-relative:text;v-text-anchor:middle" coordsize="1261745,1242060" o:gfxdata="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" path="m630872,nsc979294,,1261745,278045,1261745,621030r-630872,c630873,414020,630872,207010,630872,xem630872,nfc979294,,1261745,278045,1261745,621030e" filled="f" strokecolor="black [3213]">
+              <v:shape w14:anchorId="6E6FEF3C" id="Arc 17" o:spid="_x0000_s1026" style="position:absolute;margin-left:379.85pt;margin-top:9.9pt;width:99.35pt;height:97.8pt;rotation:-11085362fd;z-index:251674112;visibility:visible;mso-wrap-style:square;mso-wrap-distance-left:9pt;mso-wrap-distance-top:0;mso-wrap-distance-right:9pt;mso-wrap-distance-bottom:0;mso-position-horizontal:absolute;mso-position-horizontal-relative:text;mso-position-vertical:absolute;mso-position-vertical-relative:text;v-text-anchor:middle" coordsize="1261745,1242060" o:gfxdata="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" path="m630872,nsc979294,,1261745,278045,1261745,621030r-630872,c630873,414020,630872,207010,630872,xem630872,nfc979294,,1261745,278045,1261745,621030e" filled="f" strokecolor="black [3213]">
                 <v:path arrowok="t" o:connecttype="custom" o:connectlocs="630872,0;1261745,621030" o:connectangles="0,0"/>
               </v:shape>
             </w:pict>
@@ -2003,7 +1966,7 @@
         <mc:AlternateContent>
           <mc:Choice Requires="wps">
             <w:drawing>
-              <wp:anchor distT="0" distB="0" distL="114300" distR="114300" simplePos="0" relativeHeight="251665920" behindDoc="0" locked="0" layoutInCell="1" allowOverlap="1" wp14:anchorId="7C0BDCF2" wp14:editId="6E283369">
+              <wp:anchor distT="0" distB="0" distL="114300" distR="114300" simplePos="0" relativeHeight="251665920" behindDoc="0" locked="0" layoutInCell="1" allowOverlap="1" wp14:anchorId="1466501C" wp14:editId="341C054F">
                 <wp:simplePos x="0" y="0"/>
                 <wp:positionH relativeFrom="column">
                   <wp:posOffset>2228850</wp:posOffset>
@@ -2062,7 +2025,7 @@
           </mc:Choice>
           <mc:Fallback>
             <w:pict>
-              <v:shape id="Arc 10" o:spid="_x0000_s1026" style="position:absolute;margin-left:175.5pt;margin-top:.5pt;width:99.35pt;height:97.8pt;rotation:5279595fd;z-index:251665920;visibility:visible;mso-wrap-style:square;mso-wrap-distance-left:9pt;mso-wrap-distance-top:0;mso-wrap-distance-right:9pt;mso-wrap-distance-bottom:0;mso-position-horizontal:absolute;mso-position-horizontal-relative:text;mso-position-vertical:absolute;mso-position-vertical-relative:text;v-text-anchor:middle" coordsize="1261745,1242060" o:gfxdata="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" path="m630872,nsc979294,,1261745,278045,1261745,621030r-630872,c630873,414020,630872,207010,630872,xem630872,nfc979294,,1261745,278045,1261745,621030e" filled="f" strokecolor="black [3213]">
+              <v:shape w14:anchorId="4E0B0BE6" id="Arc 10" o:spid="_x0000_s1026" style="position:absolute;margin-left:175.5pt;margin-top:.5pt;width:99.35pt;height:97.8pt;rotation:5279595fd;z-index:251665920;visibility:visible;mso-wrap-style:square;mso-wrap-distance-left:9pt;mso-wrap-distance-top:0;mso-wrap-distance-right:9pt;mso-wrap-distance-bottom:0;mso-position-horizontal:absolute;mso-position-horizontal-relative:text;mso-position-vertical:absolute;mso-position-vertical-relative:text;v-text-anchor:middle" coordsize="1261745,1242060" o:gfxdata="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" path="m630872,nsc979294,,1261745,278045,1261745,621030r-630872,c630873,414020,630872,207010,630872,xem630872,nfc979294,,1261745,278045,1261745,621030e" filled="f" strokecolor="black [3213]">
                 <v:path arrowok="t" o:connecttype="custom" o:connectlocs="630872,0;1261745,621030" o:connectangles="0,0"/>
               </v:shape>
             </w:pict>
@@ -2101,7 +2064,7 @@
         <mc:AlternateContent>
           <mc:Choice Requires="wps">
             <w:drawing>
-              <wp:anchor distT="0" distB="0" distL="114300" distR="114300" simplePos="0" relativeHeight="251656704" behindDoc="0" locked="0" layoutInCell="0" allowOverlap="1" wp14:anchorId="28EB71EE" wp14:editId="6B7E8C94">
+              <wp:anchor distT="0" distB="0" distL="114300" distR="114300" simplePos="0" relativeHeight="251656704" behindDoc="0" locked="0" layoutInCell="0" allowOverlap="1" wp14:anchorId="320477F3" wp14:editId="707A6D5B">
                 <wp:simplePos x="0" y="0"/>
                 <wp:positionH relativeFrom="column">
                   <wp:posOffset>-57150</wp:posOffset>
@@ -2183,14 +2146,12 @@
                               </w:rPr>
                               <w:t xml:space="preserve">Tout fonctionne correctement sauf la communication qui ne s'effectue pas à tous les coups et le problème hardware qui empêche les piles d'alimenter mon circuit lorsqu'elles ne sont pas encore </w:t>
                             </w:r>
-                            <w:proofErr w:type="gramStart"/>
                             <w:r>
                               <w:rPr>
                                 <w:sz w:val="28"/>
                               </w:rPr>
-                              <w:t>vide</w:t>
+                              <w:t>vides</w:t>
                             </w:r>
-                            <w:proofErr w:type="gramEnd"/>
                             <w:r>
                               <w:rPr>
                                 <w:sz w:val="28"/>
@@ -2223,7 +2184,7 @@
           </mc:Choice>
           <mc:Fallback>
             <w:pict>
-              <v:shape id="Text Box 5" o:spid="_x0000_s1029" type="#_x0000_t202" style="position:absolute;margin-left:-4.5pt;margin-top:28pt;width:714.15pt;height:107.35pt;z-index:251656704;visibility:visible;mso-wrap-style:square;mso-width-percent:0;mso-height-percent:0;mso-wrap-distance-left:9pt;mso-wrap-distance-top:0;mso-wrap-distance-right:9pt;mso-wrap-distance-bottom:0;mso-position-horizontal:absolute;mso-position-horizontal-relative:text;mso-position-vertical:absolute;mso-position-vertical-relative:text;mso-width-percent:0;mso-height-percent:0;mso-width-relative:page;mso-height-relative:page;v-text-anchor:top" o:gfxdata="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" o:allowincell="f" strokecolor="#7f7f7f" strokeweight="1pt">
+              <v:shape w14:anchorId="320477F3" id="Text Box 5" o:spid="_x0000_s1028" type="#_x0000_t202" style="position:absolute;margin-left:-4.5pt;margin-top:28pt;width:714.15pt;height:107.35pt;z-index:251656704;visibility:visible;mso-wrap-style:square;mso-width-percent:0;mso-height-percent:0;mso-wrap-distance-left:9pt;mso-wrap-distance-top:0;mso-wrap-distance-right:9pt;mso-wrap-distance-bottom:0;mso-position-horizontal:absolute;mso-position-horizontal-relative:text;mso-position-vertical:absolute;mso-position-vertical-relative:text;mso-width-percent:0;mso-height-percent:0;mso-width-relative:page;mso-height-relative:page;v-text-anchor:top" o:gfxdata="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" o:allowincell="f" strokecolor="#7f7f7f" strokeweight="1pt">
                 <v:textbox>
                   <w:txbxContent>
                     <w:p>
@@ -2265,14 +2226,12 @@
                         </w:rPr>
                         <w:t xml:space="preserve">Tout fonctionne correctement sauf la communication qui ne s'effectue pas à tous les coups et le problème hardware qui empêche les piles d'alimenter mon circuit lorsqu'elles ne sont pas encore </w:t>
                       </w:r>
-                      <w:proofErr w:type="gramStart"/>
                       <w:r>
                         <w:rPr>
                           <w:sz w:val="28"/>
                         </w:rPr>
-                        <w:t>vide</w:t>
+                        <w:t>vides</w:t>
                       </w:r>
-                      <w:proofErr w:type="gramEnd"/>
                       <w:r>
                         <w:rPr>
                           <w:sz w:val="28"/>
@@ -2296,8 +2255,8 @@
       </w:r>
     </w:p>
     <w:sectPr>
-      <w:headerReference w:type="default" r:id="rId11"/>
-      <w:footerReference w:type="default" r:id="rId12"/>
+      <w:headerReference w:type="default" r:id="rId10"/>
+      <w:footerReference w:type="default" r:id="rId11"/>
       <w:pgSz w:w="16840" w:h="23814" w:code="269"/>
       <w:pgMar w:top="3971" w:right="1389" w:bottom="1418" w:left="1418" w:header="737" w:footer="0" w:gutter="0"/>
       <w:cols w:space="720"/>
@@ -2307,7 +2266,7 @@
 </file>
 
 <file path=word/endnotes.xml><?xml version="1.0" encoding="utf-8"?>
-<w:endnotes xmlns:wpc="http://schemas.microsoft.com/office/word/2010/wordprocessingCanvas" xmlns:mc="http://schemas.openxmlformats.org/markup-compatibility/2006" xmlns:o="urn:schemas-microsoft-com:office:office" xmlns:r="http://schemas.openxmlformats.org/officeDocument/2006/relationships" xmlns:m="http://schemas.openxmlformats.org/officeDocument/2006/math" xmlns:v="urn:schemas-microsoft-com:vml" xmlns:wp14="http://schemas.microsoft.com/office/word/2010/wordprocessingDrawing" xmlns:wp="http://schemas.openxmlformats.org/drawingml/2006/wordprocessingDrawing" xmlns:w10="urn:schemas-microsoft-com:office:word" xmlns:w="http://schemas.openxmlformats.org/wordprocessingml/2006/main" xmlns:w14="http://schemas.microsoft.com/office/word/2010/wordml" xmlns:wpg="http://schemas.microsoft.com/office/word/2010/wordprocessingGroup" xmlns:wpi="http://schemas.microsoft.com/office/word/2010/wordprocessingInk" xmlns:wne="http://schemas.microsoft.com/office/word/2006/wordml" xmlns:wps="http://schemas.microsoft.com/office/word/2010/wordprocessingShape" mc:Ignorable="w14 wp14">
+<w:endnotes xmlns:wpc="http://schemas.microsoft.com/office/word/2010/wordprocessingCanvas" xmlns:cx="http://schemas.microsoft.com/office/drawing/2014/chartex" xmlns:cx1="http://schemas.microsoft.com/office/drawing/2015/9/8/chartex" xmlns:cx2="http://schemas.microsoft.com/office/drawing/2015/10/21/chartex" xmlns:cx3="http://schemas.microsoft.com/office/drawing/2016/5/9/chartex" xmlns:cx4="http://schemas.microsoft.com/office/drawing/2016/5/10/chartex" xmlns:cx5="http://schemas.microsoft.com/office/drawing/2016/5/11/chartex" xmlns:cx6="http://schemas.microsoft.com/office/drawing/2016/5/12/chartex" xmlns:cx7="http://schemas.microsoft.com/office/drawing/2016/5/13/chartex" xmlns:cx8="http://schemas.microsoft.com/office/drawing/2016/5/14/chartex" xmlns:mc="http://schemas.openxmlformats.org/markup-compatibility/2006" xmlns:aink="http://schemas.microsoft.com/office/drawing/2016/ink" xmlns:am3d="http://schemas.microsoft.com/office/drawing/2017/model3d" xmlns:o="urn:schemas-microsoft-com:office:office" xmlns:oel="http://schemas.microsoft.com/office/2019/extlst" xmlns:r="http://schemas.openxmlformats.org/officeDocument/2006/relationships" xmlns:m="http://schemas.openxmlformats.org/officeDocument/2006/math" xmlns:v="urn:schemas-microsoft-com:vml" xmlns:wp14="http://schemas.microsoft.com/office/word/2010/wordprocessingDrawing" xmlns:wp="http://schemas.openxmlformats.org/drawingml/2006/wordprocessingDrawing" xmlns:w10="urn:schemas-microsoft-com:office:word" xmlns:w="http://schemas.openxmlformats.org/wordprocessingml/2006/main" xmlns:w14="http://schemas.microsoft.com/office/word/2010/wordml" xmlns:w15="http://schemas.microsoft.com/office/word/2012/wordml" xmlns:w16cex="http://schemas.microsoft.com/office/word/2018/wordml/cex" xmlns:w16cid="http://schemas.microsoft.com/office/word/2016/wordml/cid" xmlns:w16="http://schemas.microsoft.com/office/word/2018/wordml" xmlns:w16du="http://schemas.microsoft.com/office/word/2023/wordml/word16du" xmlns:w16sdtdh="http://schemas.microsoft.com/office/word/2020/wordml/sdtdatahash" xmlns:w16se="http://schemas.microsoft.com/office/word/2015/wordml/symex" xmlns:wpg="http://schemas.microsoft.com/office/word/2010/wordprocessingGroup" xmlns:wpi="http://schemas.microsoft.com/office/word/2010/wordprocessingInk" xmlns:wne="http://schemas.microsoft.com/office/word/2006/wordml" xmlns:wps="http://schemas.microsoft.com/office/word/2010/wordprocessingShape" mc:Ignorable="w14 w15 w16se w16cid w16 w16cex w16sdtdh w16du wp14">
   <w:endnote w:type="separator" w:id="-1">
     <w:p>
       <w:r>
@@ -2326,7 +2285,7 @@
 </file>
 
 <file path=word/footer1.xml><?xml version="1.0" encoding="utf-8"?>
-<w:ftr xmlns:wpc="http://schemas.microsoft.com/office/word/2010/wordprocessingCanvas" xmlns:mc="http://schemas.openxmlformats.org/markup-compatibility/2006" xmlns:o="urn:schemas-microsoft-com:office:office" xmlns:r="http://schemas.openxmlformats.org/officeDocument/2006/relationships" xmlns:m="http://schemas.openxmlformats.org/officeDocument/2006/math" xmlns:v="urn:schemas-microsoft-com:vml" xmlns:wp14="http://schemas.microsoft.com/office/word/2010/wordprocessingDrawing" xmlns:wp="http://schemas.openxmlformats.org/drawingml/2006/wordprocessingDrawing" xmlns:w10="urn:schemas-microsoft-com:office:word" xmlns:w="http://schemas.openxmlformats.org/wordprocessingml/2006/main" xmlns:w14="http://schemas.microsoft.com/office/word/2010/wordml" xmlns:wpg="http://schemas.microsoft.com/office/word/2010/wordprocessingGroup" xmlns:wpi="http://schemas.microsoft.com/office/word/2010/wordprocessingInk" xmlns:wne="http://schemas.microsoft.com/office/word/2006/wordml" xmlns:wps="http://schemas.microsoft.com/office/word/2010/wordprocessingShape" mc:Ignorable="w14 wp14">
+<w:ftr xmlns:wpc="http://schemas.microsoft.com/office/word/2010/wordprocessingCanvas" xmlns:cx="http://schemas.microsoft.com/office/drawing/2014/chartex" xmlns:cx1="http://schemas.microsoft.com/office/drawing/2015/9/8/chartex" xmlns:cx2="http://schemas.microsoft.com/office/drawing/2015/10/21/chartex" xmlns:cx3="http://schemas.microsoft.com/office/drawing/2016/5/9/chartex" xmlns:cx4="http://schemas.microsoft.com/office/drawing/2016/5/10/chartex" xmlns:cx5="http://schemas.microsoft.com/office/drawing/2016/5/11/chartex" xmlns:cx6="http://schemas.microsoft.com/office/drawing/2016/5/12/chartex" xmlns:cx7="http://schemas.microsoft.com/office/drawing/2016/5/13/chartex" xmlns:cx8="http://schemas.microsoft.com/office/drawing/2016/5/14/chartex" xmlns:mc="http://schemas.openxmlformats.org/markup-compatibility/2006" xmlns:aink="http://schemas.microsoft.com/office/drawing/2016/ink" xmlns:am3d="http://schemas.microsoft.com/office/drawing/2017/model3d" xmlns:o="urn:schemas-microsoft-com:office:office" xmlns:oel="http://schemas.microsoft.com/office/2019/extlst" xmlns:r="http://schemas.openxmlformats.org/officeDocument/2006/relationships" xmlns:m="http://schemas.openxmlformats.org/officeDocument/2006/math" xmlns:v="urn:schemas-microsoft-com:vml" xmlns:wp14="http://schemas.microsoft.com/office/word/2010/wordprocessingDrawing" xmlns:wp="http://schemas.openxmlformats.org/drawingml/2006/wordprocessingDrawing" xmlns:w10="urn:schemas-microsoft-com:office:word" xmlns:w="http://schemas.openxmlformats.org/wordprocessingml/2006/main" xmlns:w14="http://schemas.microsoft.com/office/word/2010/wordml" xmlns:w15="http://schemas.microsoft.com/office/word/2012/wordml" xmlns:w16cex="http://schemas.microsoft.com/office/word/2018/wordml/cex" xmlns:w16cid="http://schemas.microsoft.com/office/word/2016/wordml/cid" xmlns:w16="http://schemas.microsoft.com/office/word/2018/wordml" xmlns:w16du="http://schemas.microsoft.com/office/word/2023/wordml/word16du" xmlns:w16sdtdh="http://schemas.microsoft.com/office/word/2020/wordml/sdtdatahash" xmlns:w16se="http://schemas.microsoft.com/office/word/2015/wordml/symex" xmlns:wpg="http://schemas.microsoft.com/office/word/2010/wordprocessingGroup" xmlns:wpi="http://schemas.microsoft.com/office/word/2010/wordprocessingInk" xmlns:wne="http://schemas.microsoft.com/office/word/2006/wordml" xmlns:wps="http://schemas.microsoft.com/office/word/2010/wordprocessingShape" mc:Ignorable="w14 w15 w16se w16cid w16 w16cex w16sdtdh w16du wp14">
   <w:tbl>
     <w:tblPr>
       <w:tblW w:w="14425" w:type="dxa"/>
@@ -2392,25 +2351,7 @@
               <w:color w:val="FF0000"/>
               <w:sz w:val="28"/>
             </w:rPr>
-            <w:t xml:space="preserve">rue de </w:t>
-          </w:r>
-          <w:proofErr w:type="spellStart"/>
-          <w:r>
-            <w:rPr>
-              <w:b/>
-              <w:color w:val="FF0000"/>
-              <w:sz w:val="28"/>
-            </w:rPr>
-            <w:t>Sébeillon</w:t>
-          </w:r>
-          <w:proofErr w:type="spellEnd"/>
-          <w:r>
-            <w:rPr>
-              <w:b/>
-              <w:color w:val="FF0000"/>
-              <w:sz w:val="28"/>
-            </w:rPr>
-            <w:t xml:space="preserve"> 12, 1004 Lausanne</w:t>
+            <w:t>rue de Sébeillon 12, 1004 Lausanne</w:t>
           </w:r>
         </w:p>
       </w:tc>
@@ -2462,7 +2403,7 @@
               <w:lang w:eastAsia="fr-CH"/>
             </w:rPr>
             <w:drawing>
-              <wp:inline distT="0" distB="0" distL="0" distR="0" wp14:anchorId="6C492C65" wp14:editId="4E39033F">
+              <wp:inline distT="0" distB="0" distL="0" distR="0" wp14:anchorId="0EFE2907" wp14:editId="4778A313">
                 <wp:extent cx="299085" cy="502285"/>
                 <wp:effectExtent l="0" t="0" r="5715" b="0"/>
                 <wp:docPr id="13" name="Image 13" descr="logoVD-monochrome-noir"/>
@@ -2527,7 +2468,7 @@
 </file>
 
 <file path=word/footnotes.xml><?xml version="1.0" encoding="utf-8"?>
-<w:footnotes xmlns:wpc="http://schemas.microsoft.com/office/word/2010/wordprocessingCanvas" xmlns:mc="http://schemas.openxmlformats.org/markup-compatibility/2006" xmlns:o="urn:schemas-microsoft-com:office:office" xmlns:r="http://schemas.openxmlformats.org/officeDocument/2006/relationships" xmlns:m="http://schemas.openxmlformats.org/officeDocument/2006/math" xmlns:v="urn:schemas-microsoft-com:vml" xmlns:wp14="http://schemas.microsoft.com/office/word/2010/wordprocessingDrawing" xmlns:wp="http://schemas.openxmlformats.org/drawingml/2006/wordprocessingDrawing" xmlns:w10="urn:schemas-microsoft-com:office:word" xmlns:w="http://schemas.openxmlformats.org/wordprocessingml/2006/main" xmlns:w14="http://schemas.microsoft.com/office/word/2010/wordml" xmlns:wpg="http://schemas.microsoft.com/office/word/2010/wordprocessingGroup" xmlns:wpi="http://schemas.microsoft.com/office/word/2010/wordprocessingInk" xmlns:wne="http://schemas.microsoft.com/office/word/2006/wordml" xmlns:wps="http://schemas.microsoft.com/office/word/2010/wordprocessingShape" mc:Ignorable="w14 wp14">
+<w:footnotes xmlns:wpc="http://schemas.microsoft.com/office/word/2010/wordprocessingCanvas" xmlns:cx="http://schemas.microsoft.com/office/drawing/2014/chartex" xmlns:cx1="http://schemas.microsoft.com/office/drawing/2015/9/8/chartex" xmlns:cx2="http://schemas.microsoft.com/office/drawing/2015/10/21/chartex" xmlns:cx3="http://schemas.microsoft.com/office/drawing/2016/5/9/chartex" xmlns:cx4="http://schemas.microsoft.com/office/drawing/2016/5/10/chartex" xmlns:cx5="http://schemas.microsoft.com/office/drawing/2016/5/11/chartex" xmlns:cx6="http://schemas.microsoft.com/office/drawing/2016/5/12/chartex" xmlns:cx7="http://schemas.microsoft.com/office/drawing/2016/5/13/chartex" xmlns:cx8="http://schemas.microsoft.com/office/drawing/2016/5/14/chartex" xmlns:mc="http://schemas.openxmlformats.org/markup-compatibility/2006" xmlns:aink="http://schemas.microsoft.com/office/drawing/2016/ink" xmlns:am3d="http://schemas.microsoft.com/office/drawing/2017/model3d" xmlns:o="urn:schemas-microsoft-com:office:office" xmlns:oel="http://schemas.microsoft.com/office/2019/extlst" xmlns:r="http://schemas.openxmlformats.org/officeDocument/2006/relationships" xmlns:m="http://schemas.openxmlformats.org/officeDocument/2006/math" xmlns:v="urn:schemas-microsoft-com:vml" xmlns:wp14="http://schemas.microsoft.com/office/word/2010/wordprocessingDrawing" xmlns:wp="http://schemas.openxmlformats.org/drawingml/2006/wordprocessingDrawing" xmlns:w10="urn:schemas-microsoft-com:office:word" xmlns:w="http://schemas.openxmlformats.org/wordprocessingml/2006/main" xmlns:w14="http://schemas.microsoft.com/office/word/2010/wordml" xmlns:w15="http://schemas.microsoft.com/office/word/2012/wordml" xmlns:w16cex="http://schemas.microsoft.com/office/word/2018/wordml/cex" xmlns:w16cid="http://schemas.microsoft.com/office/word/2016/wordml/cid" xmlns:w16="http://schemas.microsoft.com/office/word/2018/wordml" xmlns:w16du="http://schemas.microsoft.com/office/word/2023/wordml/word16du" xmlns:w16sdtdh="http://schemas.microsoft.com/office/word/2020/wordml/sdtdatahash" xmlns:w16se="http://schemas.microsoft.com/office/word/2015/wordml/symex" xmlns:wpg="http://schemas.microsoft.com/office/word/2010/wordprocessingGroup" xmlns:wpi="http://schemas.microsoft.com/office/word/2010/wordprocessingInk" xmlns:wne="http://schemas.microsoft.com/office/word/2006/wordml" xmlns:wps="http://schemas.microsoft.com/office/word/2010/wordprocessingShape" mc:Ignorable="w14 w15 w16se w16cid w16 w16cex w16sdtdh w16du wp14">
   <w:footnote w:type="separator" w:id="-1">
     <w:p>
       <w:r>
@@ -2546,7 +2487,7 @@
 </file>
 
 <file path=word/header1.xml><?xml version="1.0" encoding="utf-8"?>
-<w:hdr xmlns:wpc="http://schemas.microsoft.com/office/word/2010/wordprocessingCanvas" xmlns:mc="http://schemas.openxmlformats.org/markup-compatibility/2006" xmlns:o="urn:schemas-microsoft-com:office:office" xmlns:r="http://schemas.openxmlformats.org/officeDocument/2006/relationships" xmlns:m="http://schemas.openxmlformats.org/officeDocument/2006/math" xmlns:v="urn:schemas-microsoft-com:vml" xmlns:wp14="http://schemas.microsoft.com/office/word/2010/wordprocessingDrawing" xmlns:wp="http://schemas.openxmlformats.org/drawingml/2006/wordprocessingDrawing" xmlns:w10="urn:schemas-microsoft-com:office:word" xmlns:w="http://schemas.openxmlformats.org/wordprocessingml/2006/main" xmlns:w14="http://schemas.microsoft.com/office/word/2010/wordml" xmlns:wpg="http://schemas.microsoft.com/office/word/2010/wordprocessingGroup" xmlns:wpi="http://schemas.microsoft.com/office/word/2010/wordprocessingInk" xmlns:wne="http://schemas.microsoft.com/office/word/2006/wordml" xmlns:wps="http://schemas.microsoft.com/office/word/2010/wordprocessingShape" mc:Ignorable="w14 wp14">
+<w:hdr xmlns:wpc="http://schemas.microsoft.com/office/word/2010/wordprocessingCanvas" xmlns:cx="http://schemas.microsoft.com/office/drawing/2014/chartex" xmlns:cx1="http://schemas.microsoft.com/office/drawing/2015/9/8/chartex" xmlns:cx2="http://schemas.microsoft.com/office/drawing/2015/10/21/chartex" xmlns:cx3="http://schemas.microsoft.com/office/drawing/2016/5/9/chartex" xmlns:cx4="http://schemas.microsoft.com/office/drawing/2016/5/10/chartex" xmlns:cx5="http://schemas.microsoft.com/office/drawing/2016/5/11/chartex" xmlns:cx6="http://schemas.microsoft.com/office/drawing/2016/5/12/chartex" xmlns:cx7="http://schemas.microsoft.com/office/drawing/2016/5/13/chartex" xmlns:cx8="http://schemas.microsoft.com/office/drawing/2016/5/14/chartex" xmlns:mc="http://schemas.openxmlformats.org/markup-compatibility/2006" xmlns:aink="http://schemas.microsoft.com/office/drawing/2016/ink" xmlns:am3d="http://schemas.microsoft.com/office/drawing/2017/model3d" xmlns:o="urn:schemas-microsoft-com:office:office" xmlns:oel="http://schemas.microsoft.com/office/2019/extlst" xmlns:r="http://schemas.openxmlformats.org/officeDocument/2006/relationships" xmlns:m="http://schemas.openxmlformats.org/officeDocument/2006/math" xmlns:v="urn:schemas-microsoft-com:vml" xmlns:wp14="http://schemas.microsoft.com/office/word/2010/wordprocessingDrawing" xmlns:wp="http://schemas.openxmlformats.org/drawingml/2006/wordprocessingDrawing" xmlns:w10="urn:schemas-microsoft-com:office:word" xmlns:w="http://schemas.openxmlformats.org/wordprocessingml/2006/main" xmlns:w14="http://schemas.microsoft.com/office/word/2010/wordml" xmlns:w15="http://schemas.microsoft.com/office/word/2012/wordml" xmlns:w16cex="http://schemas.microsoft.com/office/word/2018/wordml/cex" xmlns:w16cid="http://schemas.microsoft.com/office/word/2016/wordml/cid" xmlns:w16="http://schemas.microsoft.com/office/word/2018/wordml" xmlns:w16du="http://schemas.microsoft.com/office/word/2023/wordml/word16du" xmlns:w16sdtdh="http://schemas.microsoft.com/office/word/2020/wordml/sdtdatahash" xmlns:w16se="http://schemas.microsoft.com/office/word/2015/wordml/symex" xmlns:wpg="http://schemas.microsoft.com/office/word/2010/wordprocessingGroup" xmlns:wpi="http://schemas.microsoft.com/office/word/2010/wordprocessingInk" xmlns:wne="http://schemas.microsoft.com/office/word/2006/wordml" xmlns:wps="http://schemas.microsoft.com/office/word/2010/wordprocessingShape" mc:Ignorable="w14 w15 w16se w16cid w16 w16cex w16sdtdh w16du wp14">
   <w:p>
     <w:pPr>
       <w:pStyle w:val="En-tte"/>
@@ -2569,7 +2510,7 @@
       <mc:AlternateContent>
         <mc:Choice Requires="wps">
           <w:drawing>
-            <wp:anchor distT="0" distB="0" distL="114300" distR="114300" simplePos="0" relativeHeight="251658240" behindDoc="0" locked="0" layoutInCell="0" allowOverlap="1" wp14:anchorId="7768BC8F" wp14:editId="0816C326">
+            <wp:anchor distT="0" distB="0" distL="114300" distR="114300" simplePos="0" relativeHeight="251658240" behindDoc="0" locked="0" layoutInCell="0" allowOverlap="1" wp14:anchorId="3260949A" wp14:editId="3E319EC1">
               <wp:simplePos x="0" y="0"/>
               <wp:positionH relativeFrom="column">
                 <wp:posOffset>-123371</wp:posOffset>
@@ -2631,7 +2572,7 @@
                               <w:lang w:eastAsia="fr-CH"/>
                             </w:rPr>
                             <w:drawing>
-                              <wp:inline distT="0" distB="0" distL="0" distR="0" wp14:anchorId="33BB7DDD" wp14:editId="3AD849D2">
+                              <wp:inline distT="0" distB="0" distL="0" distR="0" wp14:anchorId="42125D82" wp14:editId="559A2675">
                                 <wp:extent cx="2881396" cy="386950"/>
                                 <wp:effectExtent l="0" t="0" r="0" b="0"/>
                                 <wp:docPr id="14" name="Image 14"/>
@@ -2720,11 +2661,11 @@
         </mc:Choice>
         <mc:Fallback>
           <w:pict>
-            <v:shapetype id="_x0000_t202" coordsize="21600,21600" o:spt="202" path="m,l,21600r21600,l21600,xe">
+            <v:shapetype w14:anchorId="3260949A" id="_x0000_t202" coordsize="21600,21600" o:spt="202" path="m,l,21600r21600,l21600,xe">
               <v:stroke joinstyle="miter"/>
               <v:path gradientshapeok="t" o:connecttype="rect"/>
             </v:shapetype>
-            <v:shape id="_x0000_s1032" type="#_x0000_t202" style="position:absolute;margin-left:-9.7pt;margin-top:-10.1pt;width:247pt;height:83.95pt;z-index:251658240;visibility:visible;mso-wrap-style:square;mso-width-percent:0;mso-height-percent:0;mso-wrap-distance-left:9pt;mso-wrap-distance-top:0;mso-wrap-distance-right:9pt;mso-wrap-distance-bottom:0;mso-position-horizontal:absolute;mso-position-horizontal-relative:text;mso-position-vertical:absolute;mso-position-vertical-relative:text;mso-width-percent:0;mso-height-percent:0;mso-width-relative:page;mso-height-relative:page;v-text-anchor:top" o:gfxdata="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" o:allowincell="f" stroked="f" strokeweight=".5pt">
+            <v:shape id="Text Box 6" o:spid="_x0000_s1029" type="#_x0000_t202" style="position:absolute;margin-left:-9.7pt;margin-top:-10.1pt;width:247pt;height:83.95pt;z-index:251658240;visibility:visible;mso-wrap-style:square;mso-width-percent:0;mso-height-percent:0;mso-wrap-distance-left:9pt;mso-wrap-distance-top:0;mso-wrap-distance-right:9pt;mso-wrap-distance-bottom:0;mso-position-horizontal:absolute;mso-position-horizontal-relative:text;mso-position-vertical:absolute;mso-position-vertical-relative:text;mso-width-percent:0;mso-height-percent:0;mso-width-relative:page;mso-height-relative:page;v-text-anchor:top" o:gfxdata="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" o:allowincell="f" stroked="f" strokeweight=".5pt">
               <v:textbox>
                 <w:txbxContent>
                   <w:p>
@@ -2748,7 +2689,7 @@
                         <w:lang w:eastAsia="fr-CH"/>
                       </w:rPr>
                       <w:drawing>
-                        <wp:inline distT="0" distB="0" distL="0" distR="0" wp14:anchorId="33BB7DDD" wp14:editId="3AD849D2">
+                        <wp:inline distT="0" distB="0" distL="0" distR="0" wp14:anchorId="42125D82" wp14:editId="559A2675">
                           <wp:extent cx="2881396" cy="386950"/>
                           <wp:effectExtent l="0" t="0" r="0" b="0"/>
                           <wp:docPr id="14" name="Image 14"/>
@@ -2765,7 +2706,7 @@
                                   </pic:cNvPicPr>
                                 </pic:nvPicPr>
                                 <pic:blipFill rotWithShape="1">
-                                  <a:blip r:embed="rId2">
+                                  <a:blip r:embed="rId1">
                                     <a:extLst>
                                       <a:ext uri="{28A0092B-C50C-407E-A947-70E740481C1C}">
                                         <a14:useLocalDpi xmlns:a14="http://schemas.microsoft.com/office/drawing/2010/main" val="0"/>
@@ -2874,7 +2815,7 @@
       <mc:AlternateContent>
         <mc:Choice Requires="wps">
           <w:drawing>
-            <wp:anchor distT="0" distB="0" distL="114300" distR="114300" simplePos="0" relativeHeight="251660288" behindDoc="0" locked="0" layoutInCell="1" allowOverlap="1" wp14:anchorId="4173B549" wp14:editId="0EFE90E8">
+            <wp:anchor distT="0" distB="0" distL="114300" distR="114300" simplePos="0" relativeHeight="251660288" behindDoc="0" locked="0" layoutInCell="1" allowOverlap="1" wp14:anchorId="10A41E8B" wp14:editId="03347877">
               <wp:simplePos x="0" y="0"/>
               <wp:positionH relativeFrom="column">
                 <wp:posOffset>-89731</wp:posOffset>
@@ -2978,11 +2919,7 @@
         </mc:Choice>
         <mc:Fallback>
           <w:pict>
-            <v:shapetype id="_x0000_t202" coordsize="21600,21600" o:spt="202" path="m,l,21600r21600,l21600,xe">
-              <v:stroke joinstyle="miter"/>
-              <v:path gradientshapeok="t" o:connecttype="rect"/>
-            </v:shapetype>
-            <v:shape id="Zone de texte 1" o:spid="_x0000_s1034" type="#_x0000_t202" style="position:absolute;margin-left:-7.05pt;margin-top:4.5pt;width:137.45pt;height:24.65pt;z-index:251660288;visibility:visible;mso-wrap-style:square;mso-width-percent:0;mso-height-percent:0;mso-wrap-distance-left:9pt;mso-wrap-distance-top:0;mso-wrap-distance-right:9pt;mso-wrap-distance-bottom:0;mso-position-horizontal:absolute;mso-position-horizontal-relative:text;mso-position-vertical:absolute;mso-position-vertical-relative:text;mso-width-percent:0;mso-height-percent:0;mso-width-relative:margin;mso-height-relative:margin;v-text-anchor:top" o:gfxdata="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" filled="f" stroked="f" strokeweight=".5pt">
+            <v:shape w14:anchorId="10A41E8B" id="Zone de texte 1" o:spid="_x0000_s1030" type="#_x0000_t202" style="position:absolute;margin-left:-7.05pt;margin-top:4.5pt;width:137.45pt;height:24.65pt;z-index:251660288;visibility:visible;mso-wrap-style:square;mso-width-percent:0;mso-height-percent:0;mso-wrap-distance-left:9pt;mso-wrap-distance-top:0;mso-wrap-distance-right:9pt;mso-wrap-distance-bottom:0;mso-position-horizontal:absolute;mso-position-horizontal-relative:text;mso-position-vertical:absolute;mso-position-vertical-relative:text;mso-width-percent:0;mso-height-percent:0;mso-width-relative:margin;mso-height-relative:margin;v-text-anchor:top" o:gfxdata="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" filled="f" stroked="f" strokeweight=".5pt">
               <v:textbox>
                 <w:txbxContent>
                   <w:p>
@@ -3035,21 +2972,12 @@
       </w:rPr>
       <w:tab/>
     </w:r>
-    <w:proofErr w:type="spellStart"/>
     <w:r>
       <w:rPr>
         <w:smallCaps/>
         <w:sz w:val="28"/>
       </w:rPr>
-      <w:t>Technicien-ne</w:t>
-    </w:r>
-    <w:proofErr w:type="spellEnd"/>
-    <w:r>
-      <w:rPr>
-        <w:smallCaps/>
-        <w:sz w:val="28"/>
-      </w:rPr>
-      <w:t xml:space="preserve"> ES en</w:t>
+      <w:t>Technicien-ne ES en</w:t>
     </w:r>
     <w:r>
       <w:rPr>
@@ -3106,10 +3034,10 @@
 </file>
 
 <file path=word/numbering.xml><?xml version="1.0" encoding="utf-8"?>
-<w:numbering xmlns:wpc="http://schemas.microsoft.com/office/word/2010/wordprocessingCanvas" xmlns:mc="http://schemas.openxmlformats.org/markup-compatibility/2006" xmlns:o="urn:schemas-microsoft-com:office:office" xmlns:r="http://schemas.openxmlformats.org/officeDocument/2006/relationships" xmlns:m="http://schemas.openxmlformats.org/officeDocument/2006/math" xmlns:v="urn:schemas-microsoft-com:vml" xmlns:wp14="http://schemas.microsoft.com/office/word/2010/wordprocessingDrawing" xmlns:wp="http://schemas.openxmlformats.org/drawingml/2006/wordprocessingDrawing" xmlns:w10="urn:schemas-microsoft-com:office:word" xmlns:w="http://schemas.openxmlformats.org/wordprocessingml/2006/main" xmlns:w14="http://schemas.microsoft.com/office/word/2010/wordml" xmlns:wpg="http://schemas.microsoft.com/office/word/2010/wordprocessingGroup" xmlns:wpi="http://schemas.microsoft.com/office/word/2010/wordprocessingInk" xmlns:wne="http://schemas.microsoft.com/office/word/2006/wordml" xmlns:wps="http://schemas.microsoft.com/office/word/2010/wordprocessingShape" mc:Ignorable="w14 wp14">
+<w:numbering xmlns:wpc="http://schemas.microsoft.com/office/word/2010/wordprocessingCanvas" xmlns:cx="http://schemas.microsoft.com/office/drawing/2014/chartex" xmlns:cx1="http://schemas.microsoft.com/office/drawing/2015/9/8/chartex" xmlns:cx2="http://schemas.microsoft.com/office/drawing/2015/10/21/chartex" xmlns:cx3="http://schemas.microsoft.com/office/drawing/2016/5/9/chartex" xmlns:cx4="http://schemas.microsoft.com/office/drawing/2016/5/10/chartex" xmlns:cx5="http://schemas.microsoft.com/office/drawing/2016/5/11/chartex" xmlns:cx6="http://schemas.microsoft.com/office/drawing/2016/5/12/chartex" xmlns:cx7="http://schemas.microsoft.com/office/drawing/2016/5/13/chartex" xmlns:cx8="http://schemas.microsoft.com/office/drawing/2016/5/14/chartex" xmlns:mc="http://schemas.openxmlformats.org/markup-compatibility/2006" xmlns:aink="http://schemas.microsoft.com/office/drawing/2016/ink" xmlns:am3d="http://schemas.microsoft.com/office/drawing/2017/model3d" xmlns:o="urn:schemas-microsoft-com:office:office" xmlns:oel="http://schemas.microsoft.com/office/2019/extlst" xmlns:r="http://schemas.openxmlformats.org/officeDocument/2006/relationships" xmlns:m="http://schemas.openxmlformats.org/officeDocument/2006/math" xmlns:v="urn:schemas-microsoft-com:vml" xmlns:wp14="http://schemas.microsoft.com/office/word/2010/wordprocessingDrawing" xmlns:wp="http://schemas.openxmlformats.org/drawingml/2006/wordprocessingDrawing" xmlns:w10="urn:schemas-microsoft-com:office:word" xmlns:w="http://schemas.openxmlformats.org/wordprocessingml/2006/main" xmlns:w14="http://schemas.microsoft.com/office/word/2010/wordml" xmlns:w15="http://schemas.microsoft.com/office/word/2012/wordml" xmlns:w16cex="http://schemas.microsoft.com/office/word/2018/wordml/cex" xmlns:w16cid="http://schemas.microsoft.com/office/word/2016/wordml/cid" xmlns:w16="http://schemas.microsoft.com/office/word/2018/wordml" xmlns:w16du="http://schemas.microsoft.com/office/word/2023/wordml/word16du" xmlns:w16sdtdh="http://schemas.microsoft.com/office/word/2020/wordml/sdtdatahash" xmlns:w16se="http://schemas.microsoft.com/office/word/2015/wordml/symex" xmlns:wpg="http://schemas.microsoft.com/office/word/2010/wordprocessingGroup" xmlns:wpi="http://schemas.microsoft.com/office/word/2010/wordprocessingInk" xmlns:wne="http://schemas.microsoft.com/office/word/2006/wordml" xmlns:wps="http://schemas.microsoft.com/office/word/2010/wordprocessingShape" mc:Ignorable="w14 w15 w16se w16cid w16 w16cex w16sdtdh w16du wp14">
   <w:numPicBullet w:numPicBulletId="0">
     <w:pict>
-      <v:shapetype id="_x0000_t75" coordsize="21600,21600" o:spt="75" o:preferrelative="t" path="m@4@5l@4@11@9@11@9@5xe" filled="f" stroked="f">
+      <v:shapetype w14:anchorId="60D9A0AF" id="_x0000_t75" coordsize="21600,21600" o:spt="75" o:preferrelative="t" path="m@4@5l@4@11@9@11@9@5xe" filled="f" stroked="f">
         <v:stroke joinstyle="miter"/>
         <v:formulas>
           <v:f eqn="if lineDrawn pixelLineWidth 0"/>
@@ -3128,12 +3056,12 @@
         <v:path o:extrusionok="f" gradientshapeok="t" o:connecttype="rect"/>
         <o:lock v:ext="edit" aspectratio="t"/>
       </v:shapetype>
-      <v:shape id="_x0000_i1026" type="#_x0000_t75" style="width:228.5pt;height:392.1pt" o:bullet="t">
+      <v:shape id="_x0000_i1026" type="#_x0000_t75" style="width:228pt;height:391.5pt" o:bullet="t">
         <v:imagedata r:id="rId1" o:title="logoVD-monochrome-noir"/>
       </v:shape>
     </w:pict>
   </w:numPicBullet>
-  <w:abstractNum w:abstractNumId="0">
+  <w:abstractNum w:abstractNumId="0" w15:restartNumberingAfterBreak="0">
     <w:nsid w:val="1BB22FD8"/>
     <w:multiLevelType w:val="hybridMultilevel"/>
     <w:tmpl w:val="B790C208"/>
@@ -3245,14 +3173,14 @@
       </w:rPr>
     </w:lvl>
   </w:abstractNum>
-  <w:num w:numId="1">
+  <w:num w:numId="1" w16cid:durableId="1393772370">
     <w:abstractNumId w:val="0"/>
   </w:num>
 </w:numbering>
 </file>
 
 <file path=word/styles.xml><?xml version="1.0" encoding="utf-8"?>
-<w:styles xmlns:mc="http://schemas.openxmlformats.org/markup-compatibility/2006" xmlns:r="http://schemas.openxmlformats.org/officeDocument/2006/relationships" xmlns:w="http://schemas.openxmlformats.org/wordprocessingml/2006/main" xmlns:w14="http://schemas.microsoft.com/office/word/2010/wordml" mc:Ignorable="w14">
+<w:styles xmlns:mc="http://schemas.openxmlformats.org/markup-compatibility/2006" xmlns:r="http://schemas.openxmlformats.org/officeDocument/2006/relationships" xmlns:w="http://schemas.openxmlformats.org/wordprocessingml/2006/main" xmlns:w14="http://schemas.microsoft.com/office/word/2010/wordml" xmlns:w15="http://schemas.microsoft.com/office/word/2012/wordml" xmlns:w16cex="http://schemas.microsoft.com/office/word/2018/wordml/cex" xmlns:w16cid="http://schemas.microsoft.com/office/word/2016/wordml/cid" xmlns:w16="http://schemas.microsoft.com/office/word/2018/wordml" xmlns:w16du="http://schemas.microsoft.com/office/word/2023/wordml/word16du" xmlns:w16sdtdh="http://schemas.microsoft.com/office/word/2020/wordml/sdtdatahash" xmlns:w16se="http://schemas.microsoft.com/office/word/2015/wordml/symex" mc:Ignorable="w14 w15 w16se w16cid w16 w16cex w16sdtdh w16du">
   <w:docDefaults>
     <w:rPrDefault>
       <w:rPr>
@@ -3262,7 +3190,7 @@
     </w:rPrDefault>
     <w:pPrDefault/>
   </w:docDefaults>
-  <w:latentStyles w:defLockedState="0" w:defUIPriority="0" w:defSemiHidden="0" w:defUnhideWhenUsed="0" w:defQFormat="0" w:count="267">
+  <w:latentStyles w:defLockedState="0" w:defUIPriority="0" w:defSemiHidden="0" w:defUnhideWhenUsed="0" w:defQFormat="0" w:count="376">
     <w:lsdException w:name="Normal" w:qFormat="1"/>
     <w:lsdException w:name="heading 1" w:qFormat="1"/>
     <w:lsdException w:name="heading 2" w:semiHidden="1" w:unhideWhenUsed="1" w:qFormat="1"/>
@@ -3278,6 +3206,50 @@
     <w:lsdException w:name="Subtitle" w:qFormat="1"/>
     <w:lsdException w:name="Strong" w:qFormat="1"/>
     <w:lsdException w:name="Emphasis" w:qFormat="1"/>
+    <w:lsdException w:name="Normal Table" w:semiHidden="1" w:unhideWhenUsed="1"/>
+    <w:lsdException w:name="Table Simple 1" w:semiHidden="1" w:unhideWhenUsed="1"/>
+    <w:lsdException w:name="Table Simple 2" w:semiHidden="1" w:unhideWhenUsed="1"/>
+    <w:lsdException w:name="Table Simple 3" w:semiHidden="1" w:unhideWhenUsed="1"/>
+    <w:lsdException w:name="Table Classic 1" w:semiHidden="1" w:unhideWhenUsed="1"/>
+    <w:lsdException w:name="Table Classic 2" w:semiHidden="1" w:unhideWhenUsed="1"/>
+    <w:lsdException w:name="Table Classic 3" w:semiHidden="1" w:unhideWhenUsed="1"/>
+    <w:lsdException w:name="Table Classic 4" w:semiHidden="1" w:unhideWhenUsed="1"/>
+    <w:lsdException w:name="Table Colorful 1" w:semiHidden="1" w:unhideWhenUsed="1"/>
+    <w:lsdException w:name="Table Colorful 2" w:semiHidden="1" w:unhideWhenUsed="1"/>
+    <w:lsdException w:name="Table Colorful 3" w:semiHidden="1" w:unhideWhenUsed="1"/>
+    <w:lsdException w:name="Table Columns 1" w:semiHidden="1" w:unhideWhenUsed="1"/>
+    <w:lsdException w:name="Table Columns 2" w:semiHidden="1" w:unhideWhenUsed="1"/>
+    <w:lsdException w:name="Table Columns 3" w:semiHidden="1" w:unhideWhenUsed="1"/>
+    <w:lsdException w:name="Table Columns 4" w:semiHidden="1" w:unhideWhenUsed="1"/>
+    <w:lsdException w:name="Table Columns 5" w:semiHidden="1" w:unhideWhenUsed="1"/>
+    <w:lsdException w:name="Table Grid 1" w:semiHidden="1" w:unhideWhenUsed="1"/>
+    <w:lsdException w:name="Table Grid 2" w:semiHidden="1" w:unhideWhenUsed="1"/>
+    <w:lsdException w:name="Table Grid 3" w:semiHidden="1" w:unhideWhenUsed="1"/>
+    <w:lsdException w:name="Table Grid 4" w:semiHidden="1" w:unhideWhenUsed="1"/>
+    <w:lsdException w:name="Table Grid 5" w:semiHidden="1" w:unhideWhenUsed="1"/>
+    <w:lsdException w:name="Table Grid 6" w:semiHidden="1" w:unhideWhenUsed="1"/>
+    <w:lsdException w:name="Table Grid 7" w:semiHidden="1" w:unhideWhenUsed="1"/>
+    <w:lsdException w:name="Table Grid 8" w:semiHidden="1" w:unhideWhenUsed="1"/>
+    <w:lsdException w:name="Table List 1" w:semiHidden="1" w:unhideWhenUsed="1"/>
+    <w:lsdException w:name="Table List 2" w:semiHidden="1" w:unhideWhenUsed="1"/>
+    <w:lsdException w:name="Table List 3" w:semiHidden="1" w:unhideWhenUsed="1"/>
+    <w:lsdException w:name="Table List 4" w:semiHidden="1" w:unhideWhenUsed="1"/>
+    <w:lsdException w:name="Table List 5" w:semiHidden="1" w:unhideWhenUsed="1"/>
+    <w:lsdException w:name="Table List 6" w:semiHidden="1" w:unhideWhenUsed="1"/>
+    <w:lsdException w:name="Table List 7" w:semiHidden="1" w:unhideWhenUsed="1"/>
+    <w:lsdException w:name="Table List 8" w:semiHidden="1" w:unhideWhenUsed="1"/>
+    <w:lsdException w:name="Table 3D effects 1" w:semiHidden="1" w:unhideWhenUsed="1"/>
+    <w:lsdException w:name="Table 3D effects 2" w:semiHidden="1" w:unhideWhenUsed="1"/>
+    <w:lsdException w:name="Table 3D effects 3" w:semiHidden="1" w:unhideWhenUsed="1"/>
+    <w:lsdException w:name="Table Contemporary" w:semiHidden="1" w:unhideWhenUsed="1"/>
+    <w:lsdException w:name="Table Elegant" w:semiHidden="1" w:unhideWhenUsed="1"/>
+    <w:lsdException w:name="Table Professional" w:semiHidden="1" w:unhideWhenUsed="1"/>
+    <w:lsdException w:name="Table Subtle 1" w:semiHidden="1" w:unhideWhenUsed="1"/>
+    <w:lsdException w:name="Table Subtle 2" w:semiHidden="1" w:unhideWhenUsed="1"/>
+    <w:lsdException w:name="Table Web 1" w:semiHidden="1" w:unhideWhenUsed="1"/>
+    <w:lsdException w:name="Table Web 2" w:semiHidden="1" w:unhideWhenUsed="1"/>
+    <w:lsdException w:name="Table Web 3" w:semiHidden="1" w:unhideWhenUsed="1"/>
+    <w:lsdException w:name="Table Theme" w:semiHidden="1" w:unhideWhenUsed="1"/>
     <w:lsdException w:name="Placeholder Text" w:semiHidden="1" w:uiPriority="99"/>
     <w:lsdException w:name="No Spacing" w:uiPriority="1" w:qFormat="1"/>
     <w:lsdException w:name="Light Shading" w:uiPriority="60"/>
@@ -3389,287 +3361,115 @@
     <w:lsdException w:name="Book Title" w:uiPriority="33" w:qFormat="1"/>
     <w:lsdException w:name="Bibliography" w:semiHidden="1" w:uiPriority="37" w:unhideWhenUsed="1"/>
     <w:lsdException w:name="TOC Heading" w:semiHidden="1" w:uiPriority="39" w:unhideWhenUsed="1" w:qFormat="1"/>
-  </w:latentStyles>
-  <w:style w:type="paragraph" w:default="1" w:styleId="Normal">
-    <w:name w:val="Normal"/>
-    <w:qFormat/>
-    <w:rPr>
-      <w:rFonts w:ascii="Arial" w:hAnsi="Arial" w:cs="Arial"/>
-      <w:sz w:val="22"/>
-      <w:szCs w:val="22"/>
-      <w:lang w:eastAsia="fr-FR"/>
-    </w:rPr>
-  </w:style>
-  <w:style w:type="paragraph" w:styleId="Titre1">
-    <w:name w:val="heading 1"/>
-    <w:basedOn w:val="Normal"/>
-    <w:next w:val="Normal"/>
-    <w:qFormat/>
-    <w:pPr>
-      <w:tabs>
-        <w:tab w:val="left" w:pos="142"/>
-      </w:tabs>
-      <w:spacing w:before="360" w:after="240"/>
-      <w:ind w:left="142"/>
-      <w:outlineLvl w:val="0"/>
-    </w:pPr>
-    <w:rPr>
-      <w:b/>
-      <w:bCs/>
-      <w:sz w:val="24"/>
-      <w:szCs w:val="24"/>
-    </w:rPr>
-  </w:style>
-  <w:style w:type="character" w:default="1" w:styleId="Policepardfaut">
-    <w:name w:val="Default Paragraph Font"/>
-    <w:uiPriority w:val="1"/>
-    <w:semiHidden/>
-    <w:unhideWhenUsed/>
-  </w:style>
-  <w:style w:type="table" w:default="1" w:styleId="TableauNormal">
-    <w:name w:val="Normal Table"/>
-    <w:uiPriority w:val="99"/>
-    <w:semiHidden/>
-    <w:unhideWhenUsed/>
-    <w:tblPr>
-      <w:tblInd w:w="0" w:type="dxa"/>
-      <w:tblCellMar>
-        <w:top w:w="0" w:type="dxa"/>
-        <w:left w:w="108" w:type="dxa"/>
-        <w:bottom w:w="0" w:type="dxa"/>
-        <w:right w:w="108" w:type="dxa"/>
-      </w:tblCellMar>
-    </w:tblPr>
-  </w:style>
-  <w:style w:type="numbering" w:default="1" w:styleId="Aucuneliste">
-    <w:name w:val="No List"/>
-    <w:uiPriority w:val="99"/>
-    <w:semiHidden/>
-    <w:unhideWhenUsed/>
-  </w:style>
-  <w:style w:type="paragraph" w:styleId="En-tte">
-    <w:name w:val="header"/>
-    <w:basedOn w:val="Normal"/>
-    <w:pPr>
-      <w:tabs>
-        <w:tab w:val="center" w:pos="4536"/>
-        <w:tab w:val="right" w:pos="9072"/>
-      </w:tabs>
-    </w:pPr>
-  </w:style>
-  <w:style w:type="paragraph" w:styleId="Pieddepage">
-    <w:name w:val="footer"/>
-    <w:basedOn w:val="Normal"/>
-    <w:pPr>
-      <w:tabs>
-        <w:tab w:val="center" w:pos="4536"/>
-        <w:tab w:val="right" w:pos="9072"/>
-      </w:tabs>
-    </w:pPr>
-  </w:style>
-  <w:style w:type="character" w:styleId="Numrodepage">
-    <w:name w:val="page number"/>
-    <w:basedOn w:val="Policepardfaut"/>
-  </w:style>
-  <w:style w:type="paragraph" w:styleId="Adressedestinataire">
-    <w:name w:val="envelope address"/>
-    <w:basedOn w:val="Normal"/>
-    <w:pPr>
-      <w:framePr w:w="7938" w:h="1985" w:hRule="exact" w:hSpace="141" w:wrap="auto" w:hAnchor="page" w:xAlign="center" w:yAlign="bottom"/>
-      <w:ind w:left="2835"/>
-    </w:pPr>
-    <w:rPr>
-      <w:sz w:val="28"/>
-      <w:szCs w:val="28"/>
-    </w:rPr>
-  </w:style>
-  <w:style w:type="character" w:styleId="Lienhypertexte">
-    <w:name w:val="Hyperlink"/>
-    <w:rsid w:val="00EF3AE9"/>
-    <w:rPr>
-      <w:color w:val="0000FF"/>
-      <w:u w:val="single"/>
-    </w:rPr>
-  </w:style>
-  <w:style w:type="table" w:styleId="Grilledutableau">
-    <w:name w:val="Table Grid"/>
-    <w:basedOn w:val="TableauNormal"/>
-    <w:rsid w:val="00EF3AE9"/>
-    <w:tblPr>
-      <w:tblBorders>
-        <w:top w:val="single" w:sz="4" w:space="0" w:color="auto"/>
-        <w:left w:val="single" w:sz="4" w:space="0" w:color="auto"/>
-        <w:bottom w:val="single" w:sz="4" w:space="0" w:color="auto"/>
-        <w:right w:val="single" w:sz="4" w:space="0" w:color="auto"/>
-        <w:insideH w:val="single" w:sz="4" w:space="0" w:color="auto"/>
-        <w:insideV w:val="single" w:sz="4" w:space="0" w:color="auto"/>
-      </w:tblBorders>
-    </w:tblPr>
-  </w:style>
-  <w:style w:type="paragraph" w:styleId="Textedebulles">
-    <w:name w:val="Balloon Text"/>
-    <w:basedOn w:val="Normal"/>
-    <w:link w:val="TextedebullesCar"/>
-    <w:rsid w:val="00DC2C4E"/>
-    <w:rPr>
-      <w:rFonts w:ascii="Tahoma" w:hAnsi="Tahoma" w:cs="Tahoma"/>
-      <w:sz w:val="16"/>
-      <w:szCs w:val="16"/>
-    </w:rPr>
-  </w:style>
-  <w:style w:type="character" w:customStyle="1" w:styleId="TextedebullesCar">
-    <w:name w:val="Texte de bulles Car"/>
-    <w:basedOn w:val="Policepardfaut"/>
-    <w:link w:val="Textedebulles"/>
-    <w:rsid w:val="00DC2C4E"/>
-    <w:rPr>
-      <w:rFonts w:ascii="Tahoma" w:hAnsi="Tahoma" w:cs="Tahoma"/>
-      <w:sz w:val="16"/>
-      <w:szCs w:val="16"/>
-      <w:lang w:eastAsia="fr-FR"/>
-    </w:rPr>
-  </w:style>
-</w:styles>
-</file>
-
-<file path=word/stylesWithEffects.xml><?xml version="1.0" encoding="utf-8"?>
-<w:styles xmlns:wpc="http://schemas.microsoft.com/office/word/2010/wordprocessingCanvas" xmlns:mc="http://schemas.openxmlformats.org/markup-compatibility/2006" xmlns:o="urn:schemas-microsoft-com:office:office" xmlns:r="http://schemas.openxmlformats.org/officeDocument/2006/relationships" xmlns:m="http://schemas.openxmlformats.org/officeDocument/2006/math" xmlns:v="urn:schemas-microsoft-com:vml" xmlns:wp14="http://schemas.microsoft.com/office/word/2010/wordprocessingDrawing" xmlns:wp="http://schemas.openxmlformats.org/drawingml/2006/wordprocessingDrawing" xmlns:w10="urn:schemas-microsoft-com:office:word" xmlns:w="http://schemas.openxmlformats.org/wordprocessingml/2006/main" xmlns:w14="http://schemas.microsoft.com/office/word/2010/wordml" xmlns:wpg="http://schemas.microsoft.com/office/word/2010/wordprocessingGroup" xmlns:wpi="http://schemas.microsoft.com/office/word/2010/wordprocessingInk" xmlns:wne="http://schemas.microsoft.com/office/word/2006/wordml" xmlns:wps="http://schemas.microsoft.com/office/word/2010/wordprocessingShape" mc:Ignorable="w14 wp14">
-  <w:docDefaults>
-    <w:rPrDefault>
-      <w:rPr>
-        <w:rFonts w:ascii="Times New Roman" w:eastAsia="Times New Roman" w:hAnsi="Times New Roman" w:cs="Times New Roman"/>
-        <w:lang w:val="fr-CH" w:eastAsia="fr-CH" w:bidi="ar-SA"/>
-      </w:rPr>
-    </w:rPrDefault>
-    <w:pPrDefault/>
-  </w:docDefaults>
-  <w:latentStyles w:defLockedState="0" w:defUIPriority="0" w:defSemiHidden="0" w:defUnhideWhenUsed="0" w:defQFormat="0" w:count="267">
-    <w:lsdException w:name="Normal" w:qFormat="1"/>
-    <w:lsdException w:name="heading 1" w:qFormat="1"/>
-    <w:lsdException w:name="heading 2" w:semiHidden="1" w:unhideWhenUsed="1" w:qFormat="1"/>
-    <w:lsdException w:name="heading 3" w:semiHidden="1" w:unhideWhenUsed="1" w:qFormat="1"/>
-    <w:lsdException w:name="heading 4" w:semiHidden="1" w:unhideWhenUsed="1" w:qFormat="1"/>
-    <w:lsdException w:name="heading 5" w:semiHidden="1" w:unhideWhenUsed="1" w:qFormat="1"/>
-    <w:lsdException w:name="heading 6" w:semiHidden="1" w:unhideWhenUsed="1" w:qFormat="1"/>
-    <w:lsdException w:name="heading 7" w:semiHidden="1" w:unhideWhenUsed="1" w:qFormat="1"/>
-    <w:lsdException w:name="heading 8" w:semiHidden="1" w:unhideWhenUsed="1" w:qFormat="1"/>
-    <w:lsdException w:name="heading 9" w:semiHidden="1" w:unhideWhenUsed="1" w:qFormat="1"/>
-    <w:lsdException w:name="caption" w:semiHidden="1" w:unhideWhenUsed="1" w:qFormat="1"/>
-    <w:lsdException w:name="Title" w:qFormat="1"/>
-    <w:lsdException w:name="Subtitle" w:qFormat="1"/>
-    <w:lsdException w:name="Strong" w:qFormat="1"/>
-    <w:lsdException w:name="Emphasis" w:qFormat="1"/>
-    <w:lsdException w:name="Placeholder Text" w:semiHidden="1" w:uiPriority="99"/>
-    <w:lsdException w:name="No Spacing" w:uiPriority="1" w:qFormat="1"/>
-    <w:lsdException w:name="Light Shading" w:uiPriority="60"/>
-    <w:lsdException w:name="Light List" w:uiPriority="61"/>
-    <w:lsdException w:name="Light Grid" w:uiPriority="62"/>
-    <w:lsdException w:name="Medium Shading 1" w:uiPriority="63"/>
-    <w:lsdException w:name="Medium Shading 2" w:uiPriority="64"/>
-    <w:lsdException w:name="Medium List 1" w:uiPriority="65"/>
-    <w:lsdException w:name="Medium List 2" w:uiPriority="66"/>
-    <w:lsdException w:name="Medium Grid 1" w:uiPriority="67"/>
-    <w:lsdException w:name="Medium Grid 2" w:uiPriority="68"/>
-    <w:lsdException w:name="Medium Grid 3" w:uiPriority="69"/>
-    <w:lsdException w:name="Dark List" w:uiPriority="70"/>
-    <w:lsdException w:name="Colorful Shading" w:uiPriority="71"/>
-    <w:lsdException w:name="Colorful List" w:uiPriority="72"/>
-    <w:lsdException w:name="Colorful Grid" w:uiPriority="73"/>
-    <w:lsdException w:name="Light Shading Accent 1" w:uiPriority="60"/>
-    <w:lsdException w:name="Light List Accent 1" w:uiPriority="61"/>
-    <w:lsdException w:name="Light Grid Accent 1" w:uiPriority="62"/>
-    <w:lsdException w:name="Medium Shading 1 Accent 1" w:uiPriority="63"/>
-    <w:lsdException w:name="Medium Shading 2 Accent 1" w:uiPriority="64"/>
-    <w:lsdException w:name="Medium List 1 Accent 1" w:uiPriority="65"/>
-    <w:lsdException w:name="Revision" w:semiHidden="1" w:uiPriority="99"/>
-    <w:lsdException w:name="List Paragraph" w:uiPriority="34" w:qFormat="1"/>
-    <w:lsdException w:name="Quote" w:uiPriority="29" w:qFormat="1"/>
-    <w:lsdException w:name="Intense Quote" w:uiPriority="30" w:qFormat="1"/>
-    <w:lsdException w:name="Medium List 2 Accent 1" w:uiPriority="66"/>
-    <w:lsdException w:name="Medium Grid 1 Accent 1" w:uiPriority="67"/>
-    <w:lsdException w:name="Medium Grid 2 Accent 1" w:uiPriority="68"/>
-    <w:lsdException w:name="Medium Grid 3 Accent 1" w:uiPriority="69"/>
-    <w:lsdException w:name="Dark List Accent 1" w:uiPriority="70"/>
-    <w:lsdException w:name="Colorful Shading Accent 1" w:uiPriority="71"/>
-    <w:lsdException w:name="Colorful List Accent 1" w:uiPriority="72"/>
-    <w:lsdException w:name="Colorful Grid Accent 1" w:uiPriority="73"/>
-    <w:lsdException w:name="Light Shading Accent 2" w:uiPriority="60"/>
-    <w:lsdException w:name="Light List Accent 2" w:uiPriority="61"/>
-    <w:lsdException w:name="Light Grid Accent 2" w:uiPriority="62"/>
-    <w:lsdException w:name="Medium Shading 1 Accent 2" w:uiPriority="63"/>
-    <w:lsdException w:name="Medium Shading 2 Accent 2" w:uiPriority="64"/>
-    <w:lsdException w:name="Medium List 1 Accent 2" w:uiPriority="65"/>
-    <w:lsdException w:name="Medium List 2 Accent 2" w:uiPriority="66"/>
-    <w:lsdException w:name="Medium Grid 1 Accent 2" w:uiPriority="67"/>
-    <w:lsdException w:name="Medium Grid 2 Accent 2" w:uiPriority="68"/>
-    <w:lsdException w:name="Medium Grid 3 Accent 2" w:uiPriority="69"/>
-    <w:lsdException w:name="Dark List Accent 2" w:uiPriority="70"/>
-    <w:lsdException w:name="Colorful Shading Accent 2" w:uiPriority="71"/>
-    <w:lsdException w:name="Colorful List Accent 2" w:uiPriority="72"/>
-    <w:lsdException w:name="Colorful Grid Accent 2" w:uiPriority="73"/>
-    <w:lsdException w:name="Light Shading Accent 3" w:uiPriority="60"/>
-    <w:lsdException w:name="Light List Accent 3" w:uiPriority="61"/>
-    <w:lsdException w:name="Light Grid Accent 3" w:uiPriority="62"/>
-    <w:lsdException w:name="Medium Shading 1 Accent 3" w:uiPriority="63"/>
-    <w:lsdException w:name="Medium Shading 2 Accent 3" w:uiPriority="64"/>
-    <w:lsdException w:name="Medium List 1 Accent 3" w:uiPriority="65"/>
-    <w:lsdException w:name="Medium List 2 Accent 3" w:uiPriority="66"/>
-    <w:lsdException w:name="Medium Grid 1 Accent 3" w:uiPriority="67"/>
-    <w:lsdException w:name="Medium Grid 2 Accent 3" w:uiPriority="68"/>
-    <w:lsdException w:name="Medium Grid 3 Accent 3" w:uiPriority="69"/>
-    <w:lsdException w:name="Dark List Accent 3" w:uiPriority="70"/>
-    <w:lsdException w:name="Colorful Shading Accent 3" w:uiPriority="71"/>
-    <w:lsdException w:name="Colorful List Accent 3" w:uiPriority="72"/>
-    <w:lsdException w:name="Colorful Grid Accent 3" w:uiPriority="73"/>
-    <w:lsdException w:name="Light Shading Accent 4" w:uiPriority="60"/>
-    <w:lsdException w:name="Light List Accent 4" w:uiPriority="61"/>
-    <w:lsdException w:name="Light Grid Accent 4" w:uiPriority="62"/>
-    <w:lsdException w:name="Medium Shading 1 Accent 4" w:uiPriority="63"/>
-    <w:lsdException w:name="Medium Shading 2 Accent 4" w:uiPriority="64"/>
-    <w:lsdException w:name="Medium List 1 Accent 4" w:uiPriority="65"/>
-    <w:lsdException w:name="Medium List 2 Accent 4" w:uiPriority="66"/>
-    <w:lsdException w:name="Medium Grid 1 Accent 4" w:uiPriority="67"/>
-    <w:lsdException w:name="Medium Grid 2 Accent 4" w:uiPriority="68"/>
-    <w:lsdException w:name="Medium Grid 3 Accent 4" w:uiPriority="69"/>
-    <w:lsdException w:name="Dark List Accent 4" w:uiPriority="70"/>
-    <w:lsdException w:name="Colorful Shading Accent 4" w:uiPriority="71"/>
-    <w:lsdException w:name="Colorful List Accent 4" w:uiPriority="72"/>
-    <w:lsdException w:name="Colorful Grid Accent 4" w:uiPriority="73"/>
-    <w:lsdException w:name="Light Shading Accent 5" w:uiPriority="60"/>
-    <w:lsdException w:name="Light List Accent 5" w:uiPriority="61"/>
-    <w:lsdException w:name="Light Grid Accent 5" w:uiPriority="62"/>
-    <w:lsdException w:name="Medium Shading 1 Accent 5" w:uiPriority="63"/>
-    <w:lsdException w:name="Medium Shading 2 Accent 5" w:uiPriority="64"/>
-    <w:lsdException w:name="Medium List 1 Accent 5" w:uiPriority="65"/>
-    <w:lsdException w:name="Medium List 2 Accent 5" w:uiPriority="66"/>
-    <w:lsdException w:name="Medium Grid 1 Accent 5" w:uiPriority="67"/>
-    <w:lsdException w:name="Medium Grid 2 Accent 5" w:uiPriority="68"/>
-    <w:lsdException w:name="Medium Grid 3 Accent 5" w:uiPriority="69"/>
-    <w:lsdException w:name="Dark List Accent 5" w:uiPriority="70"/>
-    <w:lsdException w:name="Colorful Shading Accent 5" w:uiPriority="71"/>
-    <w:lsdException w:name="Colorful List Accent 5" w:uiPriority="72"/>
-    <w:lsdException w:name="Colorful Grid Accent 5" w:uiPriority="73"/>
-    <w:lsdException w:name="Light Shading Accent 6" w:uiPriority="60"/>
-    <w:lsdException w:name="Light List Accent 6" w:uiPriority="61"/>
-    <w:lsdException w:name="Light Grid Accent 6" w:uiPriority="62"/>
-    <w:lsdException w:name="Medium Shading 1 Accent 6" w:uiPriority="63"/>
-    <w:lsdException w:name="Medium Shading 2 Accent 6" w:uiPriority="64"/>
-    <w:lsdException w:name="Medium List 1 Accent 6" w:uiPriority="65"/>
-    <w:lsdException w:name="Medium List 2 Accent 6" w:uiPriority="66"/>
-    <w:lsdException w:name="Medium Grid 1 Accent 6" w:uiPriority="67"/>
-    <w:lsdException w:name="Medium Grid 2 Accent 6" w:uiPriority="68"/>
-    <w:lsdException w:name="Medium Grid 3 Accent 6" w:uiPriority="69"/>
-    <w:lsdException w:name="Dark List Accent 6" w:uiPriority="70"/>
-    <w:lsdException w:name="Colorful Shading Accent 6" w:uiPriority="71"/>
-    <w:lsdException w:name="Colorful List Accent 6" w:uiPriority="72"/>
-    <w:lsdException w:name="Colorful Grid Accent 6" w:uiPriority="73"/>
-    <w:lsdException w:name="Subtle Emphasis" w:uiPriority="19" w:qFormat="1"/>
-    <w:lsdException w:name="Intense Emphasis" w:uiPriority="21" w:qFormat="1"/>
-    <w:lsdException w:name="Subtle Reference" w:uiPriority="31" w:qFormat="1"/>
-    <w:lsdException w:name="Intense Reference" w:uiPriority="32" w:qFormat="1"/>
-    <w:lsdException w:name="Book Title" w:uiPriority="33" w:qFormat="1"/>
-    <w:lsdException w:name="Bibliography" w:semiHidden="1" w:uiPriority="37" w:unhideWhenUsed="1"/>
-    <w:lsdException w:name="TOC Heading" w:semiHidden="1" w:uiPriority="39" w:unhideWhenUsed="1" w:qFormat="1"/>
+    <w:lsdException w:name="Plain Table 1" w:uiPriority="41"/>
+    <w:lsdException w:name="Plain Table 2" w:uiPriority="42"/>
+    <w:lsdException w:name="Plain Table 3" w:uiPriority="43"/>
+    <w:lsdException w:name="Plain Table 4" w:uiPriority="44"/>
+    <w:lsdException w:name="Plain Table 5" w:uiPriority="45"/>
+    <w:lsdException w:name="Grid Table Light" w:uiPriority="40"/>
+    <w:lsdException w:name="Grid Table 1 Light" w:uiPriority="46"/>
+    <w:lsdException w:name="Grid Table 2" w:uiPriority="47"/>
+    <w:lsdException w:name="Grid Table 3" w:uiPriority="48"/>
+    <w:lsdException w:name="Grid Table 4" w:uiPriority="49"/>
+    <w:lsdException w:name="Grid Table 5 Dark" w:uiPriority="50"/>
+    <w:lsdException w:name="Grid Table 6 Colorful" w:uiPriority="51"/>
+    <w:lsdException w:name="Grid Table 7 Colorful" w:uiPriority="52"/>
+    <w:lsdException w:name="Grid Table 1 Light Accent 1" w:uiPriority="46"/>
+    <w:lsdException w:name="Grid Table 2 Accent 1" w:uiPriority="47"/>
+    <w:lsdException w:name="Grid Table 3 Accent 1" w:uiPriority="48"/>
+    <w:lsdException w:name="Grid Table 4 Accent 1" w:uiPriority="49"/>
+    <w:lsdException w:name="Grid Table 5 Dark Accent 1" w:uiPriority="50"/>
+    <w:lsdException w:name="Grid Table 6 Colorful Accent 1" w:uiPriority="51"/>
+    <w:lsdException w:name="Grid Table 7 Colorful Accent 1" w:uiPriority="52"/>
+    <w:lsdException w:name="Grid Table 1 Light Accent 2" w:uiPriority="46"/>
+    <w:lsdException w:name="Grid Table 2 Accent 2" w:uiPriority="47"/>
+    <w:lsdException w:name="Grid Table 3 Accent 2" w:uiPriority="48"/>
+    <w:lsdException w:name="Grid Table 4 Accent 2" w:uiPriority="49"/>
+    <w:lsdException w:name="Grid Table 5 Dark Accent 2" w:uiPriority="50"/>
+    <w:lsdException w:name="Grid Table 6 Colorful Accent 2" w:uiPriority="51"/>
+    <w:lsdException w:name="Grid Table 7 Colorful Accent 2" w:uiPriority="52"/>
+    <w:lsdException w:name="Grid Table 1 Light Accent 3" w:uiPriority="46"/>
+    <w:lsdException w:name="Grid Table 2 Accent 3" w:uiPriority="47"/>
+    <w:lsdException w:name="Grid Table 3 Accent 3" w:uiPriority="48"/>
+    <w:lsdException w:name="Grid Table 4 Accent 3" w:uiPriority="49"/>
+    <w:lsdException w:name="Grid Table 5 Dark Accent 3" w:uiPriority="50"/>
+    <w:lsdException w:name="Grid Table 6 Colorful Accent 3" w:uiPriority="51"/>
+    <w:lsdException w:name="Grid Table 7 Colorful Accent 3" w:uiPriority="52"/>
+    <w:lsdException w:name="Grid Table 1 Light Accent 4" w:uiPriority="46"/>
+    <w:lsdException w:name="Grid Table 2 Accent 4" w:uiPriority="47"/>
+    <w:lsdException w:name="Grid Table 3 Accent 4" w:uiPriority="48"/>
+    <w:lsdException w:name="Grid Table 4 Accent 4" w:uiPriority="49"/>
+    <w:lsdException w:name="Grid Table 5 Dark Accent 4" w:uiPriority="50"/>
+    <w:lsdException w:name="Grid Table 6 Colorful Accent 4" w:uiPriority="51"/>
+    <w:lsdException w:name="Grid Table 7 Colorful Accent 4" w:uiPriority="52"/>
+    <w:lsdException w:name="Grid Table 1 Light Accent 5" w:uiPriority="46"/>
+    <w:lsdException w:name="Grid Table 2 Accent 5" w:uiPriority="47"/>
+    <w:lsdException w:name="Grid Table 3 Accent 5" w:uiPriority="48"/>
+    <w:lsdException w:name="Grid Table 4 Accent 5" w:uiPriority="49"/>
+    <w:lsdException w:name="Grid Table 5 Dark Accent 5" w:uiPriority="50"/>
+    <w:lsdException w:name="Grid Table 6 Colorful Accent 5" w:uiPriority="51"/>
+    <w:lsdException w:name="Grid Table 7 Colorful Accent 5" w:uiPriority="52"/>
+    <w:lsdException w:name="Grid Table 1 Light Accent 6" w:uiPriority="46"/>
+    <w:lsdException w:name="Grid Table 2 Accent 6" w:uiPriority="47"/>
+    <w:lsdException w:name="Grid Table 3 Accent 6" w:uiPriority="48"/>
+    <w:lsdException w:name="Grid Table 4 Accent 6" w:uiPriority="49"/>
+    <w:lsdException w:name="Grid Table 5 Dark Accent 6" w:uiPriority="50"/>
+    <w:lsdException w:name="Grid Table 6 Colorful Accent 6" w:uiPriority="51"/>
+    <w:lsdException w:name="Grid Table 7 Colorful Accent 6" w:uiPriority="52"/>
+    <w:lsdException w:name="List Table 1 Light" w:uiPriority="46"/>
+    <w:lsdException w:name="List Table 2" w:uiPriority="47"/>
+    <w:lsdException w:name="List Table 3" w:uiPriority="48"/>
+    <w:lsdException w:name="List Table 4" w:uiPriority="49"/>
+    <w:lsdException w:name="List Table 5 Dark" w:uiPriority="50"/>
+    <w:lsdException w:name="List Table 6 Colorful" w:uiPriority="51"/>
+    <w:lsdException w:name="List Table 7 Colorful" w:uiPriority="52"/>
+    <w:lsdException w:name="List Table 1 Light Accent 1" w:uiPriority="46"/>
+    <w:lsdException w:name="List Table 2 Accent 1" w:uiPriority="47"/>
+    <w:lsdException w:name="List Table 3 Accent 1" w:uiPriority="48"/>
+    <w:lsdException w:name="List Table 4 Accent 1" w:uiPriority="49"/>
+    <w:lsdException w:name="List Table 5 Dark Accent 1" w:uiPriority="50"/>
+    <w:lsdException w:name="List Table 6 Colorful Accent 1" w:uiPriority="51"/>
+    <w:lsdException w:name="List Table 7 Colorful Accent 1" w:uiPriority="52"/>
+    <w:lsdException w:name="List Table 1 Light Accent 2" w:uiPriority="46"/>
+    <w:lsdException w:name="List Table 2 Accent 2" w:uiPriority="47"/>
+    <w:lsdException w:name="List Table 3 Accent 2" w:uiPriority="48"/>
+    <w:lsdException w:name="List Table 4 Accent 2" w:uiPriority="49"/>
+    <w:lsdException w:name="List Table 5 Dark Accent 2" w:uiPriority="50"/>
+    <w:lsdException w:name="List Table 6 Colorful Accent 2" w:uiPriority="51"/>
+    <w:lsdException w:name="List Table 7 Colorful Accent 2" w:uiPriority="52"/>
+    <w:lsdException w:name="List Table 1 Light Accent 3" w:uiPriority="46"/>
+    <w:lsdException w:name="List Table 2 Accent 3" w:uiPriority="47"/>
+    <w:lsdException w:name="List Table 3 Accent 3" w:uiPriority="48"/>
+    <w:lsdException w:name="List Table 4 Accent 3" w:uiPriority="49"/>
+    <w:lsdException w:name="List Table 5 Dark Accent 3" w:uiPriority="50"/>
+    <w:lsdException w:name="List Table 6 Colorful Accent 3" w:uiPriority="51"/>
+    <w:lsdException w:name="List Table 7 Colorful Accent 3" w:uiPriority="52"/>
+    <w:lsdException w:name="List Table 1 Light Accent 4" w:uiPriority="46"/>
+    <w:lsdException w:name="List Table 2 Accent 4" w:uiPriority="47"/>
+    <w:lsdException w:name="List Table 3 Accent 4" w:uiPriority="48"/>
+    <w:lsdException w:name="List Table 4 Accent 4" w:uiPriority="49"/>
+    <w:lsdException w:name="List Table 5 Dark Accent 4" w:uiPriority="50"/>
+    <w:lsdException w:name="List Table 6 Colorful Accent 4" w:uiPriority="51"/>
+    <w:lsdException w:name="List Table 7 Colorful Accent 4" w:uiPriority="52"/>
+    <w:lsdException w:name="List Table 1 Light Accent 5" w:uiPriority="46"/>
+    <w:lsdException w:name="List Table 2 Accent 5" w:uiPriority="47"/>
+    <w:lsdException w:name="List Table 3 Accent 5" w:uiPriority="48"/>
+    <w:lsdException w:name="List Table 4 Accent 5" w:uiPriority="49"/>
+    <w:lsdException w:name="List Table 5 Dark Accent 5" w:uiPriority="50"/>
+    <w:lsdException w:name="List Table 6 Colorful Accent 5" w:uiPriority="51"/>
+    <w:lsdException w:name="List Table 7 Colorful Accent 5" w:uiPriority="52"/>
+    <w:lsdException w:name="List Table 1 Light Accent 6" w:uiPriority="46"/>
+    <w:lsdException w:name="List Table 2 Accent 6" w:uiPriority="47"/>
+    <w:lsdException w:name="List Table 3 Accent 6" w:uiPriority="48"/>
+    <w:lsdException w:name="List Table 4 Accent 6" w:uiPriority="49"/>
+    <w:lsdException w:name="List Table 5 Dark Accent 6" w:uiPriority="50"/>
+    <w:lsdException w:name="List Table 6 Colorful Accent 6" w:uiPriority="51"/>
+    <w:lsdException w:name="List Table 7 Colorful Accent 6" w:uiPriority="52"/>
+    <w:lsdException w:name="Mention" w:semiHidden="1" w:uiPriority="99" w:unhideWhenUsed="1"/>
+    <w:lsdException w:name="Smart Hyperlink" w:semiHidden="1" w:uiPriority="99" w:unhideWhenUsed="1"/>
+    <w:lsdException w:name="Hashtag" w:semiHidden="1" w:uiPriority="99" w:unhideWhenUsed="1"/>
+    <w:lsdException w:name="Unresolved Mention" w:semiHidden="1" w:uiPriority="99" w:unhideWhenUsed="1"/>
+    <w:lsdException w:name="Smart Link" w:semiHidden="1" w:uiPriority="99" w:unhideWhenUsed="1"/>
   </w:latentStyles>
   <w:style w:type="paragraph" w:default="1" w:styleId="Normal">
     <w:name w:val="Normal"/>

</xml_diff>